<commit_message>
Mang A GD2 - GD3
</commit_message>
<xml_diff>
--- a/docs/INT1313_TX_G5_DeTai05_Telemedicine_v2.2.docx
+++ b/docs/INT1313_TX_G5_DeTai05_Telemedicine_v2.2.docx
@@ -14423,123 +14423,253 @@
         </w:tc>
       </w:tr>
       <w:tr>
-        <w:trPr>
-          <w:cantSplit/>
-        </w:trPr>
-        <w:tc>
-          <w:tcPr>
-            <w:tcW w:w="718" w:type="dxa"/>
-          </w:tcPr>
-          <w:p>
-            <w:pPr>
-              <w:spacing w:before="20" w:after="20"/>
-              <w:jc w:val="left"/>
-              <w:rPr>
-                <w:rFonts w:ascii="Times New Roman" w:cs="Times New Roman" w:eastAsia="Times New Roman" w:hAnsi="Times New Roman"/>
-                <w:i w:val="1"/>
-                <w:iCs w:val="1"/>
-                <w:color w:val="7F7F7F"/>
-                <w:sz w:val="22"/>
-                <w:szCs w:val="22"/>
-              </w:rPr>
-            </w:pPr>
-            <w:r>
-              <w:rPr>
-                <w:rFonts w:ascii="Times New Roman" w:cs="Times New Roman" w:eastAsia="Times New Roman" w:hAnsi="Times New Roman"/>
-                <w:i w:val="1"/>
-                <w:iCs w:val="1"/>
-                <w:color w:val="7F7F7F"/>
-                <w:sz w:val="22"/>
-                <w:szCs w:val="22"/>
-              </w:rPr>
-            </w:r>
-          </w:p>
-        </w:tc>
-        <w:tc>
-          <w:tcPr>
-            <w:tcW w:w="2691" w:type="dxa"/>
-          </w:tcPr>
-          <w:p>
-            <w:pPr>
-              <w:spacing w:before="20" w:after="20"/>
-              <w:jc w:val="left"/>
-              <w:rPr>
-                <w:rFonts w:ascii="Times New Roman" w:cs="Times New Roman" w:eastAsia="Times New Roman" w:hAnsi="Times New Roman"/>
-                <w:i w:val="1"/>
-                <w:iCs w:val="1"/>
-                <w:color w:val="7F7F7F"/>
-                <w:sz w:val="22"/>
-                <w:szCs w:val="22"/>
-              </w:rPr>
-            </w:pPr>
-            <w:r>
-              <w:rPr>
-                <w:rFonts w:ascii="Times New Roman" w:cs="Times New Roman" w:eastAsia="Times New Roman" w:hAnsi="Times New Roman"/>
-                <w:i w:val="1"/>
-                <w:iCs w:val="1"/>
-                <w:color w:val="7F7F7F"/>
-                <w:sz w:val="22"/>
-                <w:szCs w:val="22"/>
-              </w:rPr>
-              <w:t>Mảng A, C: bổ sung theo T19, T21 (phân lớp NHAN_VIEN, BAC_SI; liên kết M:N KÊ, CHỨA, DỊ_ỨNG …)</w:t>
-            </w:r>
-          </w:p>
-        </w:tc>
-        <w:tc>
-          <w:tcPr>
-            <w:tcW w:w="3229" w:type="dxa"/>
-          </w:tcPr>
-          <w:p>
-            <w:pPr>
-              <w:spacing w:before="20" w:after="20"/>
-              <w:jc w:val="left"/>
-              <w:rPr>
-                <w:rFonts w:ascii="Times New Roman" w:cs="Times New Roman" w:eastAsia="Times New Roman" w:hAnsi="Times New Roman"/>
-                <w:i w:val="1"/>
-                <w:iCs w:val="1"/>
-                <w:color w:val="7F7F7F"/>
-                <w:sz w:val="22"/>
-                <w:szCs w:val="22"/>
-              </w:rPr>
-            </w:pPr>
-            <w:r>
-              <w:rPr>
-                <w:rFonts w:ascii="Times New Roman" w:cs="Times New Roman" w:eastAsia="Times New Roman" w:hAnsi="Times New Roman"/>
-                <w:i w:val="1"/>
-                <w:iCs w:val="1"/>
-                <w:color w:val="7F7F7F"/>
-                <w:sz w:val="22"/>
-                <w:szCs w:val="22"/>
-              </w:rPr>
-            </w:r>
-          </w:p>
-        </w:tc>
-        <w:tc>
-          <w:tcPr>
-            <w:tcW w:w="2152" w:type="dxa"/>
-          </w:tcPr>
-          <w:p>
-            <w:pPr>
-              <w:spacing w:before="20" w:after="20"/>
-              <w:jc w:val="left"/>
-              <w:rPr>
-                <w:rFonts w:ascii="Times New Roman" w:cs="Times New Roman" w:eastAsia="Times New Roman" w:hAnsi="Times New Roman"/>
-                <w:i w:val="1"/>
-                <w:iCs w:val="1"/>
-                <w:color w:val="7F7F7F"/>
-                <w:sz w:val="22"/>
-                <w:szCs w:val="22"/>
-              </w:rPr>
-            </w:pPr>
-            <w:r>
-              <w:rPr>
-                <w:rFonts w:ascii="Times New Roman" w:cs="Times New Roman" w:eastAsia="Times New Roman" w:hAnsi="Times New Roman"/>
-                <w:i w:val="1"/>
-                <w:iCs w:val="1"/>
-                <w:color w:val="7F7F7F"/>
-                <w:sz w:val="22"/>
-                <w:szCs w:val="22"/>
-              </w:rPr>
+        <w:tc>
+          <w:tcPr>
+            <w:tcW w:type="dxa" w:w="718"/>
+          </w:tcPr>
+          <w:p>
+            <w:r>
+              <w:t>1</w:t>
+            </w:r>
+          </w:p>
+        </w:tc>
+        <w:tc>
+          <w:tcPr>
+            <w:tcW w:type="dxa" w:w="2691"/>
+          </w:tcPr>
+          <w:p>
+            <w:r>
+              <w:t>Thực thể mạnh NHAN_VIEN, BAC_SI, CHUYEN_KHOA, CA_LAM_VIEC (A)</w:t>
+            </w:r>
+          </w:p>
+        </w:tc>
+        <w:tc>
+          <w:tcPr>
+            <w:tcW w:type="dxa" w:w="3229"/>
+          </w:tcPr>
+          <w:p>
+            <w:r>
+              <w:t>Bốn quan hệ cùng tên; khóa thực thể thành khóa chính</w:t>
+            </w:r>
+          </w:p>
+        </w:tc>
+        <w:tc>
+          <w:tcPr>
+            <w:tcW w:type="dxa" w:w="2152"/>
+          </w:tcPr>
+          <w:p>
+            <w:r>
+              <w:t>so_chung_chi và ten_chuyen_khoa là khóa ứng viên</w:t>
+            </w:r>
+          </w:p>
+        </w:tc>
+      </w:tr>
+      <w:tr>
+        <w:tc>
+          <w:tcPr>
+            <w:tcW w:type="dxa" w:w="718"/>
+          </w:tcPr>
+          <w:p>
+            <w:r>
+              <w:t>2</w:t>
+            </w:r>
+          </w:p>
+        </w:tc>
+        <w:tc>
+          <w:tcPr>
+            <w:tcW w:type="dxa" w:w="2691"/>
+          </w:tcPr>
+          <w:p>
+            <w:r>
+              <w:t>Thực thể yếu (A)</w:t>
+            </w:r>
+          </w:p>
+        </w:tc>
+        <w:tc>
+          <w:tcPr>
+            <w:tcW w:type="dxa" w:w="3229"/>
+          </w:tcPr>
+          <w:p>
+            <w:r>
+              <w:t>–</w:t>
+            </w:r>
+          </w:p>
+        </w:tc>
+        <w:tc>
+          <w:tcPr>
+            <w:tcW w:type="dxa" w:w="2152"/>
+          </w:tcPr>
+          <w:p>
+            <w:r>
+              <w:t>Mảng A không có</w:t>
+            </w:r>
+          </w:p>
+        </w:tc>
+      </w:tr>
+      <w:tr>
+        <w:tc>
+          <w:tcPr>
+            <w:tcW w:type="dxa" w:w="718"/>
+          </w:tcPr>
+          <w:p>
+            <w:r>
+              <w:t>3</w:t>
+            </w:r>
+          </w:p>
+        </w:tc>
+        <w:tc>
+          <w:tcPr>
+            <w:tcW w:type="dxa" w:w="2691"/>
+          </w:tcPr>
+          <w:p>
+            <w:r>
+              <w:t>Liên kết 1:1 kế thừa BAC_SI từ NHAN_VIEN (A)</w:t>
+            </w:r>
+          </w:p>
+        </w:tc>
+        <w:tc>
+          <w:tcPr>
+            <w:tcW w:type="dxa" w:w="3229"/>
+          </w:tcPr>
+          <w:p>
+            <w:r>
+              <w:t>BAC_SI.ma_bac_si vừa là PK vừa là FK</w:t>
+            </w:r>
+          </w:p>
+        </w:tc>
+        <w:tc>
+          <w:tcPr>
+            <w:tcW w:type="dxa" w:w="2152"/>
+          </w:tcPr>
+          <w:p>
+            <w:r>
+              <w:t>Lớp con giữ khóa của lớp cha</w:t>
+            </w:r>
+          </w:p>
+        </w:tc>
+      </w:tr>
+      <w:tr>
+        <w:tc>
+          <w:tcPr>
+            <w:tcW w:type="dxa" w:w="718"/>
+          </w:tcPr>
+          <w:p>
+            <w:r>
+              <w:t>4</w:t>
+            </w:r>
+          </w:p>
+        </w:tc>
+        <w:tc>
+          <w:tcPr>
+            <w:tcW w:type="dxa" w:w="2691"/>
+          </w:tcPr>
+          <w:p>
+            <w:r>
+              <w:t>Liên kết 1:N THUỘC, XẾP_CA (A)</w:t>
+            </w:r>
+          </w:p>
+        </w:tc>
+        <w:tc>
+          <w:tcPr>
+            <w:tcW w:type="dxa" w:w="3229"/>
+          </w:tcPr>
+          <w:p>
+            <w:r>
+              <w:t>BAC_SI_CHUYEN_KHOA giữ ma_chuyen_khoa; CA_LAM_VIEC giữ ma_bac_si</w:t>
+            </w:r>
+          </w:p>
+        </w:tc>
+        <w:tc>
+          <w:tcPr>
+            <w:tcW w:type="dxa" w:w="2152"/>
+          </w:tcPr>
+          <w:p>
+            <w:r>
+              <w:t>Phía N tham gia bắt buộc nên FK NOT NULL</w:t>
+            </w:r>
+          </w:p>
+        </w:tc>
+      </w:tr>
+      <w:tr>
+        <w:tc>
+          <w:tcPr>
+            <w:tcW w:type="dxa" w:w="718"/>
+          </w:tcPr>
+          <w:p>
+            <w:r>
+              <w:t>5–7</w:t>
+            </w:r>
+          </w:p>
+        </w:tc>
+        <w:tc>
+          <w:tcPr>
+            <w:tcW w:type="dxa" w:w="2691"/>
+          </w:tcPr>
+          <w:p>
+            <w:r>
+              <w:t>M:N, thuộc tính đa trị, liên kết bậc n (A)</w:t>
+            </w:r>
+          </w:p>
+        </w:tc>
+        <w:tc>
+          <w:tcPr>
+            <w:tcW w:type="dxa" w:w="3229"/>
+          </w:tcPr>
+          <w:p>
+            <w:r>
+              <w:t>–</w:t>
+            </w:r>
+          </w:p>
+        </w:tc>
+        <w:tc>
+          <w:tcPr>
+            <w:tcW w:type="dxa" w:w="2152"/>
+          </w:tcPr>
+          <w:p>
+            <w:r>
+              <w:t>Mảng A không có</w:t>
+            </w:r>
+          </w:p>
+        </w:tc>
+      </w:tr>
+      <w:tr>
+        <w:tc>
+          <w:tcPr>
+            <w:tcW w:type="dxa" w:w="718"/>
+          </w:tcPr>
+          <w:p>
+            <w:r>
+              <w:t>8</w:t>
+            </w:r>
+          </w:p>
+        </w:tc>
+        <w:tc>
+          <w:tcPr>
+            <w:tcW w:type="dxa" w:w="2691"/>
+          </w:tcPr>
+          <w:p>
+            <w:r>
+              <w:t>NHAN_VIEN → BAC_SI; BAC_SI → BAC_SI_DA_KHOA / BAC_SI_CHUYEN_KHOA (A)</w:t>
+            </w:r>
+          </w:p>
+        </w:tc>
+        <w:tc>
+          <w:tcPr>
+            <w:tcW w:type="dxa" w:w="3229"/>
+          </w:tcPr>
+          <w:p>
+            <w:r>
+              <w:t>Dùng bảng lớp cha và lớp con, PK lớp con đồng thời FK</w:t>
+            </w:r>
+          </w:p>
+        </w:tc>
+        <w:tc>
+          <w:tcPr>
+            <w:tcW w:type="dxa" w:w="2152"/>
+          </w:tcPr>
+          <w:p>
+            <w:r>
+              <w:t>8A; deferred trigger giữ partial/total và disjoint</w:t>
             </w:r>
           </w:p>
         </w:tc>
@@ -14582,13 +14712,7 @@
         </w:rPr>
       </w:pPr>
       <w:r>
-        <w:rPr>
-          <w:rFonts w:ascii="Times New Roman" w:cs="Times New Roman" w:eastAsia="Times New Roman" w:hAnsi="Times New Roman"/>
-          <w:i w:val="1"/>
-          <w:iCs w:val="1"/>
-          <w:color w:val="7F7F7F"/>
-        </w:rPr>
-        <w:t xml:space="preserve">Với mỗi phân cấp ở 2.1.3, so sánh các phương án 8A (bảng cho lớp cha và từng lớp con), 8B (chỉ bảng lớp con), 8C (một bảng, một cột phân loại), 8D (một bảng, nhiều cờ boolean). Nêu phương án chọn và lý do: số thuộc tính riêng, giá trị NULL, ràng buộc d/total, truy vấn hay dùng.</w:t>
+        <w:t>Ánh xạ mảng A chọn 8A cho NHAN_VIEN → BAC_SI (partial): thông tin chung chỉ lưu một lần ở NHAN_VIEN, còn thông tin giấy phép chỉ lưu cho bác sĩ. Với BAC_SI → BAC_SI_DA_KHOA / BAC_SI_CHUYEN_KHOA (disjoint, total), chọn 8A để mảng B có thể tham chiếu trực tiếp BAC_SI_DA_KHOA khi lập giấy chuyển; trigger deferred kiểm tra đúng một lớp con và khớp loai_bac_si. Mảng B chọn 8C như giải thích ở hàng dưới.</w:t>
       </w:r>
     </w:p>
     <w:tbl>
@@ -14740,15 +14864,9 @@
             <w:tcW w:w="1465" w:type="dxa"/>
           </w:tcPr>
           <w:p>
-            <w:pPr>
-              <w:spacing w:before="20" w:after="20"/>
-              <w:jc w:val="left"/>
-              <w:rPr>
-                <w:rFonts w:ascii="Times New Roman" w:cs="Times New Roman" w:eastAsia="Times New Roman" w:hAnsi="Times New Roman"/>
-                <w:sz w:val="22"/>
-                <w:szCs w:val="22"/>
-              </w:rPr>
-            </w:pPr>
+            <w:r>
+              <w:t>8A – bảng BAC_SI và bảng cho mỗi lớp con</w:t>
+            </w:r>
           </w:p>
         </w:tc>
         <w:tc>
@@ -14756,15 +14874,9 @@
             <w:tcW w:w="5494" w:type="dxa"/>
           </w:tcPr>
           <w:p>
-            <w:pPr>
-              <w:spacing w:before="20" w:after="20"/>
-              <w:jc w:val="left"/>
-              <w:rPr>
-                <w:rFonts w:ascii="Times New Roman" w:cs="Times New Roman" w:eastAsia="Times New Roman" w:hAnsi="Times New Roman"/>
-                <w:sz w:val="22"/>
-                <w:szCs w:val="22"/>
-              </w:rPr>
-            </w:pPr>
+            <w:r>
+              <w:t>Phân lớp disjoint, total; giữ một khóa bác sĩ dùng chung và có bảng BAC_SI_DA_KHOA làm đích FK cho giấy chuyển mảng B. Trigger deferred kiểm tra lớp con khớp loai_bac_si.</w:t>
+            </w:r>
           </w:p>
         </w:tc>
       </w:tr>
@@ -14841,6 +14953,38 @@
                 <w:szCs w:val="22"/>
               </w:rPr>
               <w:t>Phân lớp rời nhau, toàn phần, có thuộc tính phân loại; lớp con ít thuộc tính (1 và 2) và không có liên kết riêng, nên mọi liên kết của lịch hẹn (bệnh nhân, bác sĩ, giấy chuyển, lần khám) và kiểm tra trùng giờ chỉ làm trên một bảng. 8B không dùng được vì LAN_KHAM cần một bảng duy nhất để tham chiếu; 8A cần trigger bảo đảm mỗi lịch hẹn có đúng một hàng ở đúng một bảng con. Đổi lại, cột của hình thức kia để NULL, kiểm soát bằng CHECK theo hinh_thuc (BR-B04, BR-B06).</w:t>
+            </w:r>
+          </w:p>
+        </w:tc>
+      </w:tr>
+      <w:tr>
+        <w:tc>
+          <w:tcPr>
+            <w:tcW w:type="dxa" w:w="1831"/>
+          </w:tcPr>
+          <w:p>
+            <w:r>
+              <w:t>NHAN_VIEN</w:t>
+            </w:r>
+          </w:p>
+        </w:tc>
+        <w:tc>
+          <w:tcPr>
+            <w:tcW w:type="dxa" w:w="1465"/>
+          </w:tcPr>
+          <w:p>
+            <w:r>
+              <w:t>8A – bảng NHAN_VIEN và lớp con BAC_SI</w:t>
+            </w:r>
+          </w:p>
+        </w:tc>
+        <w:tc>
+          <w:tcPr>
+            <w:tcW w:type="dxa" w:w="5494"/>
+          </w:tcPr>
+          <w:p>
+            <w:r>
+              <w:t>Phân lớp partial; dữ liệu chung lưu một lần, thông tin giấy phép chỉ có ở bác sĩ.</w:t>
             </w:r>
           </w:p>
         </w:tc>
@@ -15189,13 +15333,15 @@
         </w:rPr>
       </w:pPr>
       <w:r>
-        <w:rPr>
-          <w:rFonts w:ascii="Times New Roman" w:cs="Times New Roman" w:eastAsia="Times New Roman" w:hAnsi="Times New Roman"/>
-          <w:i w:val="1"/>
-          <w:iCs w:val="1"/>
-          <w:color w:val="7F7F7F"/>
-        </w:rPr>
-        <w:t>– Mảng A, C: bổ sung theo T19, T21; vẽ Hình 2.2 khi đủ ba mảng.</w:t>
+        <w:t>– NHAN_VIEN(ma_nv, ho_ten, ngay_sinh, sdt, email, loai_nv) [A]</w:t>
+        <w:br/>
+        <w:t>– BAC_SI(ma_bac_si, so_chung_chi, ngay_cap_cc, ngay_het_han_cc, loai_bac_si) [A]</w:t>
+        <w:br/>
+        <w:t>– BAC_SI_DA_KHOA(ma_bac_si) [A]; BAC_SI_CHUYEN_KHOA(ma_bac_si, ma_chuyen_khoa) [A]</w:t>
+        <w:br/>
+        <w:t>– CHUYEN_KHOA(ma_chuyen_khoa, ten_chuyen_khoa) [A]; CA_LAM_VIEC(ma_ca, thoi_gian_bd, thoi_gian_kt, trang_thai, ma_bac_si) [A]</w:t>
+        <w:br/>
+        <w:t>Các khóa ngoại: BAC_SI.ma_bac_si → NHAN_VIEN.ma_nv; lớp con bác sĩ → BAC_SI.ma_bac_si; BAC_SI_CHUYEN_KHOA.ma_chuyen_khoa → CHUYEN_KHOA.ma_chuyen_khoa; CA_LAM_VIEC.ma_bac_si → BAC_SI.ma_bac_si. BAC_SI.ma_bac_si dùng làm khóa bác sĩ chung cho các mảng.</w:t>
       </w:r>
     </w:p>
     <w:p>
@@ -17967,211 +18113,433 @@
         </w:tc>
       </w:tr>
       <w:tr>
-        <w:trPr>
-          <w:cantSplit/>
-        </w:trPr>
-        <w:tc>
-          <w:tcPr>
-            <w:tcW w:w="1648" w:type="dxa"/>
-          </w:tcPr>
-          <w:p>
-            <w:pPr>
-              <w:spacing w:before="20" w:after="20"/>
-              <w:jc w:val="left"/>
-              <w:rPr>
-                <w:rFonts w:ascii="Times New Roman" w:cs="Times New Roman" w:eastAsia="Times New Roman" w:hAnsi="Times New Roman"/>
-                <w:i w:val="1"/>
-                <w:iCs w:val="1"/>
-                <w:color w:val="7F7F7F"/>
-                <w:sz w:val="22"/>
-                <w:szCs w:val="22"/>
-              </w:rPr>
-            </w:pPr>
-            <w:r>
-              <w:rPr>
-                <w:rFonts w:ascii="Times New Roman" w:cs="Times New Roman" w:eastAsia="Times New Roman" w:hAnsi="Times New Roman"/>
-                <w:i w:val="1"/>
-                <w:iCs w:val="1"/>
-                <w:color w:val="7F7F7F"/>
-                <w:sz w:val="22"/>
-                <w:szCs w:val="22"/>
-              </w:rPr>
-              <w:t>Mảng A, C</w:t>
-            </w:r>
-          </w:p>
-        </w:tc>
-        <w:tc>
-          <w:tcPr>
-            <w:tcW w:w="1465" w:type="dxa"/>
-          </w:tcPr>
-          <w:p>
-            <w:pPr>
-              <w:spacing w:before="20" w:after="20"/>
-              <w:jc w:val="left"/>
-              <w:rPr>
-                <w:rFonts w:ascii="Times New Roman" w:cs="Times New Roman" w:eastAsia="Times New Roman" w:hAnsi="Times New Roman"/>
-                <w:i w:val="1"/>
-                <w:iCs w:val="1"/>
-                <w:color w:val="7F7F7F"/>
-                <w:sz w:val="22"/>
-                <w:szCs w:val="22"/>
-              </w:rPr>
-            </w:pPr>
-            <w:r>
-              <w:rPr>
-                <w:rFonts w:ascii="Times New Roman" w:cs="Times New Roman" w:eastAsia="Times New Roman" w:hAnsi="Times New Roman"/>
-                <w:i w:val="1"/>
-                <w:iCs w:val="1"/>
-                <w:color w:val="7F7F7F"/>
-                <w:sz w:val="22"/>
-                <w:szCs w:val="22"/>
-              </w:rPr>
-            </w:r>
-          </w:p>
-        </w:tc>
-        <w:tc>
-          <w:tcPr>
-            <w:tcW w:w="3296" w:type="dxa"/>
-          </w:tcPr>
-          <w:p>
-            <w:pPr>
-              <w:spacing w:before="20" w:after="20"/>
-              <w:jc w:val="left"/>
-              <w:rPr>
-                <w:rFonts w:ascii="Times New Roman" w:cs="Times New Roman" w:eastAsia="Times New Roman" w:hAnsi="Times New Roman"/>
-                <w:i w:val="1"/>
-                <w:iCs w:val="1"/>
-                <w:color w:val="7F7F7F"/>
-                <w:sz w:val="22"/>
-                <w:szCs w:val="22"/>
-              </w:rPr>
-            </w:pPr>
-            <w:r>
-              <w:rPr>
-                <w:rFonts w:ascii="Times New Roman" w:cs="Times New Roman" w:eastAsia="Times New Roman" w:hAnsi="Times New Roman"/>
-                <w:i w:val="1"/>
-                <w:iCs w:val="1"/>
-                <w:color w:val="7F7F7F"/>
-                <w:sz w:val="22"/>
-                <w:szCs w:val="22"/>
-              </w:rPr>
-              <w:t>Bổ sung theo T23, T25</w:t>
-            </w:r>
-          </w:p>
-        </w:tc>
-        <w:tc>
-          <w:tcPr>
-            <w:tcW w:w="549" w:type="dxa"/>
-          </w:tcPr>
-          <w:p>
-            <w:pPr>
-              <w:spacing w:before="20" w:after="20"/>
-              <w:jc w:val="left"/>
-              <w:rPr>
-                <w:rFonts w:ascii="Times New Roman" w:cs="Times New Roman" w:eastAsia="Times New Roman" w:hAnsi="Times New Roman"/>
-                <w:i w:val="1"/>
-                <w:iCs w:val="1"/>
-                <w:color w:val="7F7F7F"/>
-                <w:sz w:val="22"/>
-                <w:szCs w:val="22"/>
-              </w:rPr>
-            </w:pPr>
-            <w:r>
-              <w:rPr>
-                <w:rFonts w:ascii="Times New Roman" w:cs="Times New Roman" w:eastAsia="Times New Roman" w:hAnsi="Times New Roman"/>
-                <w:i w:val="1"/>
-                <w:iCs w:val="1"/>
-                <w:color w:val="7F7F7F"/>
-                <w:sz w:val="22"/>
-                <w:szCs w:val="22"/>
-              </w:rPr>
-            </w:r>
-          </w:p>
-        </w:tc>
-        <w:tc>
-          <w:tcPr>
-            <w:tcW w:w="549" w:type="dxa"/>
-          </w:tcPr>
-          <w:p>
-            <w:pPr>
-              <w:spacing w:before="20" w:after="20"/>
-              <w:jc w:val="left"/>
-              <w:rPr>
-                <w:rFonts w:ascii="Times New Roman" w:cs="Times New Roman" w:eastAsia="Times New Roman" w:hAnsi="Times New Roman"/>
-                <w:i w:val="1"/>
-                <w:iCs w:val="1"/>
-                <w:color w:val="7F7F7F"/>
-                <w:sz w:val="22"/>
-                <w:szCs w:val="22"/>
-              </w:rPr>
-            </w:pPr>
-            <w:r>
-              <w:rPr>
-                <w:rFonts w:ascii="Times New Roman" w:cs="Times New Roman" w:eastAsia="Times New Roman" w:hAnsi="Times New Roman"/>
-                <w:i w:val="1"/>
-                <w:iCs w:val="1"/>
-                <w:color w:val="7F7F7F"/>
-                <w:sz w:val="22"/>
-                <w:szCs w:val="22"/>
-              </w:rPr>
-            </w:r>
-          </w:p>
-        </w:tc>
-        <w:tc>
-          <w:tcPr>
-            <w:tcW w:w="549" w:type="dxa"/>
-          </w:tcPr>
-          <w:p>
-            <w:pPr>
-              <w:spacing w:before="20" w:after="20"/>
-              <w:jc w:val="left"/>
-              <w:rPr>
-                <w:rFonts w:ascii="Times New Roman" w:cs="Times New Roman" w:eastAsia="Times New Roman" w:hAnsi="Times New Roman"/>
-                <w:i w:val="1"/>
-                <w:iCs w:val="1"/>
-                <w:color w:val="7F7F7F"/>
-                <w:sz w:val="22"/>
-                <w:szCs w:val="22"/>
-              </w:rPr>
-            </w:pPr>
-            <w:r>
-              <w:rPr>
-                <w:rFonts w:ascii="Times New Roman" w:cs="Times New Roman" w:eastAsia="Times New Roman" w:hAnsi="Times New Roman"/>
-                <w:i w:val="1"/>
-                <w:iCs w:val="1"/>
-                <w:color w:val="7F7F7F"/>
-                <w:sz w:val="22"/>
-                <w:szCs w:val="22"/>
-              </w:rPr>
-            </w:r>
-          </w:p>
-        </w:tc>
-        <w:tc>
-          <w:tcPr>
-            <w:tcW w:w="734" w:type="dxa"/>
-          </w:tcPr>
-          <w:p>
-            <w:pPr>
-              <w:spacing w:before="20" w:after="20"/>
-              <w:jc w:val="left"/>
-              <w:rPr>
-                <w:rFonts w:ascii="Times New Roman" w:cs="Times New Roman" w:eastAsia="Times New Roman" w:hAnsi="Times New Roman"/>
-                <w:i w:val="1"/>
-                <w:iCs w:val="1"/>
-                <w:color w:val="7F7F7F"/>
-                <w:sz w:val="22"/>
-                <w:szCs w:val="22"/>
-              </w:rPr>
-            </w:pPr>
-            <w:r>
-              <w:rPr>
-                <w:rFonts w:ascii="Times New Roman" w:cs="Times New Roman" w:eastAsia="Times New Roman" w:hAnsi="Times New Roman"/>
-                <w:i w:val="1"/>
-                <w:iCs w:val="1"/>
-                <w:color w:val="7F7F7F"/>
-                <w:sz w:val="22"/>
-                <w:szCs w:val="22"/>
-              </w:rPr>
+        <w:tc>
+          <w:tcPr>
+            <w:tcW w:type="dxa" w:w="1648"/>
+          </w:tcPr>
+          <w:p>
+            <w:r>
+              <w:t>NHAN_VIEN</w:t>
+            </w:r>
+          </w:p>
+        </w:tc>
+        <w:tc>
+          <w:tcPr>
+            <w:tcW w:type="dxa" w:w="1465"/>
+          </w:tcPr>
+          <w:p>
+            <w:r>
+              <w:t>ma_nv; sdt</w:t>
+            </w:r>
+          </w:p>
+        </w:tc>
+        <w:tc>
+          <w:tcPr>
+            <w:tcW w:type="dxa" w:w="3296"/>
+          </w:tcPr>
+          <w:p>
+            <w:r>
+              <w:t>ma_nv → các thuộc tính còn lại; sdt → ma_nv, các thuộc tính còn lại</w:t>
+            </w:r>
+          </w:p>
+        </w:tc>
+        <w:tc>
+          <w:tcPr>
+            <w:tcW w:type="dxa" w:w="549"/>
+          </w:tcPr>
+          <w:p>
+            <w:r>
+              <w:t>✓</w:t>
+            </w:r>
+          </w:p>
+        </w:tc>
+        <w:tc>
+          <w:tcPr>
+            <w:tcW w:type="dxa" w:w="549"/>
+          </w:tcPr>
+          <w:p>
+            <w:r>
+              <w:t>✓</w:t>
+            </w:r>
+          </w:p>
+        </w:tc>
+        <w:tc>
+          <w:tcPr>
+            <w:tcW w:type="dxa" w:w="549"/>
+          </w:tcPr>
+          <w:p>
+            <w:r>
+              <w:t>✓</w:t>
+            </w:r>
+          </w:p>
+        </w:tc>
+        <w:tc>
+          <w:tcPr>
+            <w:tcW w:type="dxa" w:w="734"/>
+          </w:tcPr>
+          <w:p>
+            <w:r>
+              <w:t>✓</w:t>
+            </w:r>
+          </w:p>
+        </w:tc>
+      </w:tr>
+      <w:tr>
+        <w:tc>
+          <w:tcPr>
+            <w:tcW w:type="dxa" w:w="1648"/>
+          </w:tcPr>
+          <w:p>
+            <w:r>
+              <w:t>BAC_SI</w:t>
+            </w:r>
+          </w:p>
+        </w:tc>
+        <w:tc>
+          <w:tcPr>
+            <w:tcW w:type="dxa" w:w="1465"/>
+          </w:tcPr>
+          <w:p>
+            <w:r>
+              <w:t>ma_bac_si; so_chung_chi</w:t>
+            </w:r>
+          </w:p>
+        </w:tc>
+        <w:tc>
+          <w:tcPr>
+            <w:tcW w:type="dxa" w:w="3296"/>
+          </w:tcPr>
+          <w:p>
+            <w:r>
+              <w:t>ma_bac_si → các thuộc tính còn lại; so_chung_chi → ma_bac_si, các thuộc tính còn lại</w:t>
+            </w:r>
+          </w:p>
+        </w:tc>
+        <w:tc>
+          <w:tcPr>
+            <w:tcW w:type="dxa" w:w="549"/>
+          </w:tcPr>
+          <w:p>
+            <w:r>
+              <w:t>✓</w:t>
+            </w:r>
+          </w:p>
+        </w:tc>
+        <w:tc>
+          <w:tcPr>
+            <w:tcW w:type="dxa" w:w="549"/>
+          </w:tcPr>
+          <w:p>
+            <w:r>
+              <w:t>✓</w:t>
+            </w:r>
+          </w:p>
+        </w:tc>
+        <w:tc>
+          <w:tcPr>
+            <w:tcW w:type="dxa" w:w="549"/>
+          </w:tcPr>
+          <w:p>
+            <w:r>
+              <w:t>✓</w:t>
+            </w:r>
+          </w:p>
+        </w:tc>
+        <w:tc>
+          <w:tcPr>
+            <w:tcW w:type="dxa" w:w="734"/>
+          </w:tcPr>
+          <w:p>
+            <w:r>
+              <w:t>✓</w:t>
+            </w:r>
+          </w:p>
+        </w:tc>
+      </w:tr>
+      <w:tr>
+        <w:tc>
+          <w:tcPr>
+            <w:tcW w:type="dxa" w:w="1648"/>
+          </w:tcPr>
+          <w:p>
+            <w:r>
+              <w:t>BAC_SI_DA_KHOA</w:t>
+            </w:r>
+          </w:p>
+        </w:tc>
+        <w:tc>
+          <w:tcPr>
+            <w:tcW w:type="dxa" w:w="1465"/>
+          </w:tcPr>
+          <w:p>
+            <w:r>
+              <w:t>ma_bac_si</w:t>
+            </w:r>
+          </w:p>
+        </w:tc>
+        <w:tc>
+          <w:tcPr>
+            <w:tcW w:type="dxa" w:w="3296"/>
+          </w:tcPr>
+          <w:p>
+            <w:r>
+              <w:t>Không có FD không tầm thường</w:t>
+            </w:r>
+          </w:p>
+        </w:tc>
+        <w:tc>
+          <w:tcPr>
+            <w:tcW w:type="dxa" w:w="549"/>
+          </w:tcPr>
+          <w:p>
+            <w:r>
+              <w:t>✓</w:t>
+            </w:r>
+          </w:p>
+        </w:tc>
+        <w:tc>
+          <w:tcPr>
+            <w:tcW w:type="dxa" w:w="549"/>
+          </w:tcPr>
+          <w:p>
+            <w:r>
+              <w:t>✓</w:t>
+            </w:r>
+          </w:p>
+        </w:tc>
+        <w:tc>
+          <w:tcPr>
+            <w:tcW w:type="dxa" w:w="549"/>
+          </w:tcPr>
+          <w:p>
+            <w:r>
+              <w:t>✓</w:t>
+            </w:r>
+          </w:p>
+        </w:tc>
+        <w:tc>
+          <w:tcPr>
+            <w:tcW w:type="dxa" w:w="734"/>
+          </w:tcPr>
+          <w:p>
+            <w:r>
+              <w:t>✓</w:t>
+            </w:r>
+          </w:p>
+        </w:tc>
+      </w:tr>
+      <w:tr>
+        <w:tc>
+          <w:tcPr>
+            <w:tcW w:type="dxa" w:w="1648"/>
+          </w:tcPr>
+          <w:p>
+            <w:r>
+              <w:t>BAC_SI_CHUYEN_KHOA</w:t>
+            </w:r>
+          </w:p>
+        </w:tc>
+        <w:tc>
+          <w:tcPr>
+            <w:tcW w:type="dxa" w:w="1465"/>
+          </w:tcPr>
+          <w:p>
+            <w:r>
+              <w:t>ma_bac_si</w:t>
+            </w:r>
+          </w:p>
+        </w:tc>
+        <w:tc>
+          <w:tcPr>
+            <w:tcW w:type="dxa" w:w="3296"/>
+          </w:tcPr>
+          <w:p>
+            <w:r>
+              <w:t>ma_bac_si → ma_chuyen_khoa</w:t>
+            </w:r>
+          </w:p>
+        </w:tc>
+        <w:tc>
+          <w:tcPr>
+            <w:tcW w:type="dxa" w:w="549"/>
+          </w:tcPr>
+          <w:p>
+            <w:r>
+              <w:t>✓</w:t>
+            </w:r>
+          </w:p>
+        </w:tc>
+        <w:tc>
+          <w:tcPr>
+            <w:tcW w:type="dxa" w:w="549"/>
+          </w:tcPr>
+          <w:p>
+            <w:r>
+              <w:t>✓</w:t>
+            </w:r>
+          </w:p>
+        </w:tc>
+        <w:tc>
+          <w:tcPr>
+            <w:tcW w:type="dxa" w:w="549"/>
+          </w:tcPr>
+          <w:p>
+            <w:r>
+              <w:t>✓</w:t>
+            </w:r>
+          </w:p>
+        </w:tc>
+        <w:tc>
+          <w:tcPr>
+            <w:tcW w:type="dxa" w:w="734"/>
+          </w:tcPr>
+          <w:p>
+            <w:r>
+              <w:t>✓</w:t>
+            </w:r>
+          </w:p>
+        </w:tc>
+      </w:tr>
+      <w:tr>
+        <w:tc>
+          <w:tcPr>
+            <w:tcW w:type="dxa" w:w="1648"/>
+          </w:tcPr>
+          <w:p>
+            <w:r>
+              <w:t>CHUYEN_KHOA</w:t>
+            </w:r>
+          </w:p>
+        </w:tc>
+        <w:tc>
+          <w:tcPr>
+            <w:tcW w:type="dxa" w:w="1465"/>
+          </w:tcPr>
+          <w:p>
+            <w:r>
+              <w:t>ma_chuyen_khoa; ten_chuyen_khoa</w:t>
+            </w:r>
+          </w:p>
+        </w:tc>
+        <w:tc>
+          <w:tcPr>
+            <w:tcW w:type="dxa" w:w="3296"/>
+          </w:tcPr>
+          <w:p>
+            <w:r>
+              <w:t>ma_chuyen_khoa ↔ ten_chuyen_khoa</w:t>
+            </w:r>
+          </w:p>
+        </w:tc>
+        <w:tc>
+          <w:tcPr>
+            <w:tcW w:type="dxa" w:w="549"/>
+          </w:tcPr>
+          <w:p>
+            <w:r>
+              <w:t>✓</w:t>
+            </w:r>
+          </w:p>
+        </w:tc>
+        <w:tc>
+          <w:tcPr>
+            <w:tcW w:type="dxa" w:w="549"/>
+          </w:tcPr>
+          <w:p>
+            <w:r>
+              <w:t>✓</w:t>
+            </w:r>
+          </w:p>
+        </w:tc>
+        <w:tc>
+          <w:tcPr>
+            <w:tcW w:type="dxa" w:w="549"/>
+          </w:tcPr>
+          <w:p>
+            <w:r>
+              <w:t>✓</w:t>
+            </w:r>
+          </w:p>
+        </w:tc>
+        <w:tc>
+          <w:tcPr>
+            <w:tcW w:type="dxa" w:w="734"/>
+          </w:tcPr>
+          <w:p>
+            <w:r>
+              <w:t>✓</w:t>
+            </w:r>
+          </w:p>
+        </w:tc>
+      </w:tr>
+      <w:tr>
+        <w:tc>
+          <w:tcPr>
+            <w:tcW w:type="dxa" w:w="1648"/>
+          </w:tcPr>
+          <w:p>
+            <w:r>
+              <w:t>CA_LAM_VIEC</w:t>
+            </w:r>
+          </w:p>
+        </w:tc>
+        <w:tc>
+          <w:tcPr>
+            <w:tcW w:type="dxa" w:w="1465"/>
+          </w:tcPr>
+          <w:p>
+            <w:r>
+              <w:t>ma_ca</w:t>
+            </w:r>
+          </w:p>
+        </w:tc>
+        <w:tc>
+          <w:tcPr>
+            <w:tcW w:type="dxa" w:w="3296"/>
+          </w:tcPr>
+          <w:p>
+            <w:r>
+              <w:t>ma_ca → các thuộc tính còn lại</w:t>
+            </w:r>
+          </w:p>
+        </w:tc>
+        <w:tc>
+          <w:tcPr>
+            <w:tcW w:type="dxa" w:w="549"/>
+          </w:tcPr>
+          <w:p>
+            <w:r>
+              <w:t>✓</w:t>
+            </w:r>
+          </w:p>
+        </w:tc>
+        <w:tc>
+          <w:tcPr>
+            <w:tcW w:type="dxa" w:w="549"/>
+          </w:tcPr>
+          <w:p>
+            <w:r>
+              <w:t>✓</w:t>
+            </w:r>
+          </w:p>
+        </w:tc>
+        <w:tc>
+          <w:tcPr>
+            <w:tcW w:type="dxa" w:w="549"/>
+          </w:tcPr>
+          <w:p>
+            <w:r>
+              <w:t>✓</w:t>
+            </w:r>
+          </w:p>
+        </w:tc>
+        <w:tc>
+          <w:tcPr>
+            <w:tcW w:type="dxa" w:w="734"/>
+          </w:tcPr>
+          <w:p>
+            <w:r>
+              <w:t>✓</w:t>
             </w:r>
           </w:p>
         </w:tc>
@@ -18214,13 +18582,7 @@
         </w:rPr>
       </w:pPr>
       <w:r>
-        <w:rPr>
-          <w:rFonts w:ascii="Times New Roman" w:cs="Times New Roman" w:eastAsia="Times New Roman" w:hAnsi="Times New Roman"/>
-          <w:i w:val="1"/>
-          <w:iCs w:val="1"/>
-          <w:color w:val="7F7F7F"/>
-        </w:rPr>
-        <w:t xml:space="preserve">– Mảng A (Đặng Hữu Khoa)</w:t>
+        <w:t>– Mảng A (Đặng Hữu Khoa): Sáu quan hệ NHAN_VIEN, BAC_SI, BAC_SI_DA_KHOA, BAC_SI_CHUYEN_KHOA, CHUYEN_KHOA và CA_LAM_VIEC đạt BCNF theo các FD đã nêu; không cần tách bảng. Chi tiết FD, bao đóng và chứng minh ở T23, T26.</w:t>
       </w:r>
     </w:p>
     <w:p>
@@ -19338,6 +19700,318 @@
                 <w:szCs w:val="22"/>
               </w:rPr>
               <w:t>Lê Ngọc Khôi</w:t>
+            </w:r>
+          </w:p>
+        </w:tc>
+      </w:tr>
+      <w:tr>
+        <w:tc>
+          <w:tcPr>
+            <w:tcW w:type="dxa" w:w="549"/>
+          </w:tcPr>
+          <w:p>
+            <w:r>
+              <w:t>6</w:t>
+            </w:r>
+          </w:p>
+        </w:tc>
+        <w:tc>
+          <w:tcPr>
+            <w:tcW w:type="dxa" w:w="2014"/>
+          </w:tcPr>
+          <w:p>
+            <w:r>
+              <w:t>nhan_vien</w:t>
+            </w:r>
+          </w:p>
+        </w:tc>
+        <w:tc>
+          <w:tcPr>
+            <w:tcW w:type="dxa" w:w="3662"/>
+          </w:tcPr>
+          <w:p>
+            <w:r>
+              <w:t>Thông tin chung của nhân viên</w:t>
+            </w:r>
+          </w:p>
+        </w:tc>
+        <w:tc>
+          <w:tcPr>
+            <w:tcW w:type="dxa" w:w="732"/>
+          </w:tcPr>
+          <w:p>
+            <w:r>
+              <w:t>A</w:t>
+            </w:r>
+          </w:p>
+        </w:tc>
+        <w:tc>
+          <w:tcPr>
+            <w:tcW w:type="dxa" w:w="1833"/>
+          </w:tcPr>
+          <w:p>
+            <w:r>
+              <w:t>Đặng Hữu Khoa</w:t>
+            </w:r>
+          </w:p>
+        </w:tc>
+      </w:tr>
+      <w:tr>
+        <w:tc>
+          <w:tcPr>
+            <w:tcW w:type="dxa" w:w="549"/>
+          </w:tcPr>
+          <w:p>
+            <w:r>
+              <w:t>7</w:t>
+            </w:r>
+          </w:p>
+        </w:tc>
+        <w:tc>
+          <w:tcPr>
+            <w:tcW w:type="dxa" w:w="2014"/>
+          </w:tcPr>
+          <w:p>
+            <w:r>
+              <w:t>bac_si</w:t>
+            </w:r>
+          </w:p>
+        </w:tc>
+        <w:tc>
+          <w:tcPr>
+            <w:tcW w:type="dxa" w:w="3662"/>
+          </w:tcPr>
+          <w:p>
+            <w:r>
+              <w:t>Giấy phép và loại hành nghề của bác sĩ</w:t>
+            </w:r>
+          </w:p>
+        </w:tc>
+        <w:tc>
+          <w:tcPr>
+            <w:tcW w:type="dxa" w:w="732"/>
+          </w:tcPr>
+          <w:p>
+            <w:r>
+              <w:t>A</w:t>
+            </w:r>
+          </w:p>
+        </w:tc>
+        <w:tc>
+          <w:tcPr>
+            <w:tcW w:type="dxa" w:w="1833"/>
+          </w:tcPr>
+          <w:p>
+            <w:r>
+              <w:t>Đặng Hữu Khoa</w:t>
+            </w:r>
+          </w:p>
+        </w:tc>
+      </w:tr>
+      <w:tr>
+        <w:tc>
+          <w:tcPr>
+            <w:tcW w:type="dxa" w:w="549"/>
+          </w:tcPr>
+          <w:p>
+            <w:r>
+              <w:t>8</w:t>
+            </w:r>
+          </w:p>
+        </w:tc>
+        <w:tc>
+          <w:tcPr>
+            <w:tcW w:type="dxa" w:w="2014"/>
+          </w:tcPr>
+          <w:p>
+            <w:r>
+              <w:t>bac_si_da_khoa</w:t>
+            </w:r>
+          </w:p>
+        </w:tc>
+        <w:tc>
+          <w:tcPr>
+            <w:tcW w:type="dxa" w:w="3662"/>
+          </w:tcPr>
+          <w:p>
+            <w:r>
+              <w:t>Lớp bác sĩ đa khoa</w:t>
+            </w:r>
+          </w:p>
+        </w:tc>
+        <w:tc>
+          <w:tcPr>
+            <w:tcW w:type="dxa" w:w="732"/>
+          </w:tcPr>
+          <w:p>
+            <w:r>
+              <w:t>A</w:t>
+            </w:r>
+          </w:p>
+        </w:tc>
+        <w:tc>
+          <w:tcPr>
+            <w:tcW w:type="dxa" w:w="1833"/>
+          </w:tcPr>
+          <w:p>
+            <w:r>
+              <w:t>Đặng Hữu Khoa</w:t>
+            </w:r>
+          </w:p>
+        </w:tc>
+      </w:tr>
+      <w:tr>
+        <w:tc>
+          <w:tcPr>
+            <w:tcW w:type="dxa" w:w="549"/>
+          </w:tcPr>
+          <w:p>
+            <w:r>
+              <w:t>9</w:t>
+            </w:r>
+          </w:p>
+        </w:tc>
+        <w:tc>
+          <w:tcPr>
+            <w:tcW w:type="dxa" w:w="2014"/>
+          </w:tcPr>
+          <w:p>
+            <w:r>
+              <w:t>bac_si_chuyen_khoa</w:t>
+            </w:r>
+          </w:p>
+        </w:tc>
+        <w:tc>
+          <w:tcPr>
+            <w:tcW w:type="dxa" w:w="3662"/>
+          </w:tcPr>
+          <w:p>
+            <w:r>
+              <w:t>Lớp bác sĩ chuyên khoa và chuyên khoa phụ trách</w:t>
+            </w:r>
+          </w:p>
+        </w:tc>
+        <w:tc>
+          <w:tcPr>
+            <w:tcW w:type="dxa" w:w="732"/>
+          </w:tcPr>
+          <w:p>
+            <w:r>
+              <w:t>A</w:t>
+            </w:r>
+          </w:p>
+        </w:tc>
+        <w:tc>
+          <w:tcPr>
+            <w:tcW w:type="dxa" w:w="1833"/>
+          </w:tcPr>
+          <w:p>
+            <w:r>
+              <w:t>Đặng Hữu Khoa</w:t>
+            </w:r>
+          </w:p>
+        </w:tc>
+      </w:tr>
+      <w:tr>
+        <w:tc>
+          <w:tcPr>
+            <w:tcW w:type="dxa" w:w="549"/>
+          </w:tcPr>
+          <w:p>
+            <w:r>
+              <w:t>10</w:t>
+            </w:r>
+          </w:p>
+        </w:tc>
+        <w:tc>
+          <w:tcPr>
+            <w:tcW w:type="dxa" w:w="2014"/>
+          </w:tcPr>
+          <w:p>
+            <w:r>
+              <w:t>chuyen_khoa</w:t>
+            </w:r>
+          </w:p>
+        </w:tc>
+        <w:tc>
+          <w:tcPr>
+            <w:tcW w:type="dxa" w:w="3662"/>
+          </w:tcPr>
+          <w:p>
+            <w:r>
+              <w:t>Danh mục chuyên khoa</w:t>
+            </w:r>
+          </w:p>
+        </w:tc>
+        <w:tc>
+          <w:tcPr>
+            <w:tcW w:type="dxa" w:w="732"/>
+          </w:tcPr>
+          <w:p>
+            <w:r>
+              <w:t>A</w:t>
+            </w:r>
+          </w:p>
+        </w:tc>
+        <w:tc>
+          <w:tcPr>
+            <w:tcW w:type="dxa" w:w="1833"/>
+          </w:tcPr>
+          <w:p>
+            <w:r>
+              <w:t>Đặng Hữu Khoa</w:t>
+            </w:r>
+          </w:p>
+        </w:tc>
+      </w:tr>
+      <w:tr>
+        <w:tc>
+          <w:tcPr>
+            <w:tcW w:type="dxa" w:w="549"/>
+          </w:tcPr>
+          <w:p>
+            <w:r>
+              <w:t>11</w:t>
+            </w:r>
+          </w:p>
+        </w:tc>
+        <w:tc>
+          <w:tcPr>
+            <w:tcW w:type="dxa" w:w="2014"/>
+          </w:tcPr>
+          <w:p>
+            <w:r>
+              <w:t>ca_lam_viec</w:t>
+            </w:r>
+          </w:p>
+        </w:tc>
+        <w:tc>
+          <w:tcPr>
+            <w:tcW w:type="dxa" w:w="3662"/>
+          </w:tcPr>
+          <w:p>
+            <w:r>
+              <w:t>Ca làm việc được xếp cho bác sĩ</w:t>
+            </w:r>
+          </w:p>
+        </w:tc>
+        <w:tc>
+          <w:tcPr>
+            <w:tcW w:type="dxa" w:w="732"/>
+          </w:tcPr>
+          <w:p>
+            <w:r>
+              <w:t>A</w:t>
+            </w:r>
+          </w:p>
+        </w:tc>
+        <w:tc>
+          <w:tcPr>
+            <w:tcW w:type="dxa" w:w="1833"/>
+          </w:tcPr>
+          <w:p>
+            <w:r>
+              <w:t>Đặng Hữu Khoa</w:t>
             </w:r>
           </w:p>
         </w:tc>
@@ -26097,15 +26771,2037 @@
         </w:rPr>
       </w:pPr>
       <w:r>
-        <w:rPr>
-          <w:rFonts w:ascii="Times New Roman" w:cs="Times New Roman" w:eastAsia="Times New Roman" w:hAnsi="Times New Roman"/>
-          <w:i w:val="1"/>
-          <w:iCs w:val="1"/>
-          <w:color w:val="7F7F7F"/>
-        </w:rPr>
-        <w:t>Bảng: … – bảng mảng A, C, bổ sung theo T29</w:t>
+        <w:t>Các bảng và thuộc tính mảng A được mô tả chi tiết bên dưới.</w:t>
       </w:r>
     </w:p>
+    <w:p>
+      <w:pPr>
+        <w:pStyle w:val="Heading3"/>
+      </w:pPr>
+      <w:r>
+        <w:t>Bảng: nhan_vien – Thông tin chung của nhân viên phòng khám</w:t>
+      </w:r>
+    </w:p>
+    <w:tbl>
+      <w:tblPr>
+        <w:tblW w:type="auto" w:w="0"/>
+        <w:tblLook w:firstColumn="1" w:firstRow="1" w:lastColumn="0" w:lastRow="0" w:noHBand="0" w:noVBand="1" w:val="04A0"/>
+      </w:tblPr>
+      <w:tblGrid>
+        <w:gridCol w:w="1337"/>
+        <w:gridCol w:w="1337"/>
+        <w:gridCol w:w="1337"/>
+        <w:gridCol w:w="1337"/>
+        <w:gridCol w:w="1337"/>
+        <w:gridCol w:w="1337"/>
+        <w:gridCol w:w="1337"/>
+      </w:tblGrid>
+      <w:tr>
+        <w:tc>
+          <w:tcPr>
+            <w:tcW w:type="dxa" w:w="1337"/>
+          </w:tcPr>
+          <w:p>
+            <w:r>
+              <w:t>Cột</w:t>
+            </w:r>
+          </w:p>
+        </w:tc>
+        <w:tc>
+          <w:tcPr>
+            <w:tcW w:type="dxa" w:w="1337"/>
+          </w:tcPr>
+          <w:p>
+            <w:r>
+              <w:t>Kiểu dữ liệu</w:t>
+            </w:r>
+          </w:p>
+        </w:tc>
+        <w:tc>
+          <w:tcPr>
+            <w:tcW w:type="dxa" w:w="1337"/>
+          </w:tcPr>
+          <w:p>
+            <w:r>
+              <w:t>Null</w:t>
+            </w:r>
+          </w:p>
+        </w:tc>
+        <w:tc>
+          <w:tcPr>
+            <w:tcW w:type="dxa" w:w="1337"/>
+          </w:tcPr>
+          <w:p>
+            <w:r>
+              <w:t>Khóa</w:t>
+            </w:r>
+          </w:p>
+        </w:tc>
+        <w:tc>
+          <w:tcPr>
+            <w:tcW w:type="dxa" w:w="1337"/>
+          </w:tcPr>
+          <w:p>
+            <w:r>
+              <w:t>Mặc định</w:t>
+            </w:r>
+          </w:p>
+        </w:tc>
+        <w:tc>
+          <w:tcPr>
+            <w:tcW w:type="dxa" w:w="1337"/>
+          </w:tcPr>
+          <w:p>
+            <w:r>
+              <w:t>Ràng buộc</w:t>
+            </w:r>
+          </w:p>
+        </w:tc>
+        <w:tc>
+          <w:tcPr>
+            <w:tcW w:type="dxa" w:w="1337"/>
+          </w:tcPr>
+          <w:p>
+            <w:r>
+              <w:t>Mô tả</w:t>
+            </w:r>
+          </w:p>
+        </w:tc>
+      </w:tr>
+      <w:tr>
+        <w:tc>
+          <w:tcPr>
+            <w:tcW w:type="dxa" w:w="1337"/>
+          </w:tcPr>
+          <w:p>
+            <w:r>
+              <w:t>ma_nv</w:t>
+            </w:r>
+          </w:p>
+        </w:tc>
+        <w:tc>
+          <w:tcPr>
+            <w:tcW w:type="dxa" w:w="1337"/>
+          </w:tcPr>
+          <w:p>
+            <w:r>
+              <w:t>Mã định danh nhân viên</w:t>
+            </w:r>
+          </w:p>
+        </w:tc>
+        <w:tc>
+          <w:tcPr>
+            <w:tcW w:type="dxa" w:w="1337"/>
+          </w:tcPr>
+          <w:p>
+            <w:r>
+              <w:t>INTEGER identity</w:t>
+            </w:r>
+          </w:p>
+        </w:tc>
+        <w:tc>
+          <w:tcPr>
+            <w:tcW w:type="dxa" w:w="1337"/>
+          </w:tcPr>
+          <w:p>
+            <w:r>
+              <w:t>Không</w:t>
+            </w:r>
+          </w:p>
+        </w:tc>
+        <w:tc>
+          <w:tcPr>
+            <w:tcW w:type="dxa" w:w="1337"/>
+          </w:tcPr>
+          <w:p>
+            <w:r>
+              <w:t>PK</w:t>
+            </w:r>
+          </w:p>
+        </w:tc>
+        <w:tc>
+          <w:tcPr>
+            <w:tcW w:type="dxa" w:w="1337"/>
+          </w:tcPr>
+          <w:p>
+            <w:r>
+              <w:t>Tự tăng</w:t>
+            </w:r>
+          </w:p>
+        </w:tc>
+        <w:tc>
+          <w:tcPr>
+            <w:tcW w:type="dxa" w:w="1337"/>
+          </w:tcPr>
+          <w:p>
+            <w:r>
+              <w:t>Duy nhất</w:t>
+            </w:r>
+          </w:p>
+        </w:tc>
+      </w:tr>
+      <w:tr>
+        <w:tc>
+          <w:tcPr>
+            <w:tcW w:type="dxa" w:w="1337"/>
+          </w:tcPr>
+          <w:p>
+            <w:r>
+              <w:t>ho_ten</w:t>
+            </w:r>
+          </w:p>
+        </w:tc>
+        <w:tc>
+          <w:tcPr>
+            <w:tcW w:type="dxa" w:w="1337"/>
+          </w:tcPr>
+          <w:p>
+            <w:r>
+              <w:t>Họ tên đầy đủ</w:t>
+            </w:r>
+          </w:p>
+        </w:tc>
+        <w:tc>
+          <w:tcPr>
+            <w:tcW w:type="dxa" w:w="1337"/>
+          </w:tcPr>
+          <w:p>
+            <w:r>
+              <w:t>VARCHAR(100)</w:t>
+            </w:r>
+          </w:p>
+        </w:tc>
+        <w:tc>
+          <w:tcPr>
+            <w:tcW w:type="dxa" w:w="1337"/>
+          </w:tcPr>
+          <w:p>
+            <w:r>
+              <w:t>Không</w:t>
+            </w:r>
+          </w:p>
+        </w:tc>
+        <w:tc>
+          <w:tcPr>
+            <w:tcW w:type="dxa" w:w="1337"/>
+          </w:tcPr>
+          <w:p>
+            <w:r/>
+          </w:p>
+        </w:tc>
+        <w:tc>
+          <w:tcPr>
+            <w:tcW w:type="dxa" w:w="1337"/>
+          </w:tcPr>
+          <w:p>
+            <w:r/>
+          </w:p>
+        </w:tc>
+        <w:tc>
+          <w:tcPr>
+            <w:tcW w:type="dxa" w:w="1337"/>
+          </w:tcPr>
+          <w:p>
+            <w:r>
+              <w:t>Không rỗng</w:t>
+            </w:r>
+          </w:p>
+        </w:tc>
+      </w:tr>
+      <w:tr>
+        <w:tc>
+          <w:tcPr>
+            <w:tcW w:type="dxa" w:w="1337"/>
+          </w:tcPr>
+          <w:p>
+            <w:r>
+              <w:t>ngay_sinh</w:t>
+            </w:r>
+          </w:p>
+        </w:tc>
+        <w:tc>
+          <w:tcPr>
+            <w:tcW w:type="dxa" w:w="1337"/>
+          </w:tcPr>
+          <w:p>
+            <w:r>
+              <w:t>Ngày sinh theo hồ sơ</w:t>
+            </w:r>
+          </w:p>
+        </w:tc>
+        <w:tc>
+          <w:tcPr>
+            <w:tcW w:type="dxa" w:w="1337"/>
+          </w:tcPr>
+          <w:p>
+            <w:r>
+              <w:t>DATE</w:t>
+            </w:r>
+          </w:p>
+        </w:tc>
+        <w:tc>
+          <w:tcPr>
+            <w:tcW w:type="dxa" w:w="1337"/>
+          </w:tcPr>
+          <w:p>
+            <w:r>
+              <w:t>Không</w:t>
+            </w:r>
+          </w:p>
+        </w:tc>
+        <w:tc>
+          <w:tcPr>
+            <w:tcW w:type="dxa" w:w="1337"/>
+          </w:tcPr>
+          <w:p>
+            <w:r/>
+          </w:p>
+        </w:tc>
+        <w:tc>
+          <w:tcPr>
+            <w:tcW w:type="dxa" w:w="1337"/>
+          </w:tcPr>
+          <w:p>
+            <w:r/>
+          </w:p>
+        </w:tc>
+        <w:tc>
+          <w:tcPr>
+            <w:tcW w:type="dxa" w:w="1337"/>
+          </w:tcPr>
+          <w:p>
+            <w:r>
+              <w:t>≤ CURRENT_DATE</w:t>
+            </w:r>
+          </w:p>
+        </w:tc>
+      </w:tr>
+      <w:tr>
+        <w:tc>
+          <w:tcPr>
+            <w:tcW w:type="dxa" w:w="1337"/>
+          </w:tcPr>
+          <w:p>
+            <w:r>
+              <w:t>sdt</w:t>
+            </w:r>
+          </w:p>
+        </w:tc>
+        <w:tc>
+          <w:tcPr>
+            <w:tcW w:type="dxa" w:w="1337"/>
+          </w:tcPr>
+          <w:p>
+            <w:r>
+              <w:t>Số điện thoại liên hệ</w:t>
+            </w:r>
+          </w:p>
+        </w:tc>
+        <w:tc>
+          <w:tcPr>
+            <w:tcW w:type="dxa" w:w="1337"/>
+          </w:tcPr>
+          <w:p>
+            <w:r>
+              <w:t>VARCHAR(10)</w:t>
+            </w:r>
+          </w:p>
+        </w:tc>
+        <w:tc>
+          <w:tcPr>
+            <w:tcW w:type="dxa" w:w="1337"/>
+          </w:tcPr>
+          <w:p>
+            <w:r>
+              <w:t>Không</w:t>
+            </w:r>
+          </w:p>
+        </w:tc>
+        <w:tc>
+          <w:tcPr>
+            <w:tcW w:type="dxa" w:w="1337"/>
+          </w:tcPr>
+          <w:p>
+            <w:r>
+              <w:t>UNIQUE</w:t>
+            </w:r>
+          </w:p>
+        </w:tc>
+        <w:tc>
+          <w:tcPr>
+            <w:tcW w:type="dxa" w:w="1337"/>
+          </w:tcPr>
+          <w:p>
+            <w:r/>
+          </w:p>
+        </w:tc>
+        <w:tc>
+          <w:tcPr>
+            <w:tcW w:type="dxa" w:w="1337"/>
+          </w:tcPr>
+          <w:p>
+            <w:r>
+              <w:t>^0[0-9]{9}$</w:t>
+            </w:r>
+          </w:p>
+        </w:tc>
+      </w:tr>
+      <w:tr>
+        <w:tc>
+          <w:tcPr>
+            <w:tcW w:type="dxa" w:w="1337"/>
+          </w:tcPr>
+          <w:p>
+            <w:r>
+              <w:t>email</w:t>
+            </w:r>
+          </w:p>
+        </w:tc>
+        <w:tc>
+          <w:tcPr>
+            <w:tcW w:type="dxa" w:w="1337"/>
+          </w:tcPr>
+          <w:p>
+            <w:r>
+              <w:t>Địa chỉ thư điện tử</w:t>
+            </w:r>
+          </w:p>
+        </w:tc>
+        <w:tc>
+          <w:tcPr>
+            <w:tcW w:type="dxa" w:w="1337"/>
+          </w:tcPr>
+          <w:p>
+            <w:r>
+              <w:t>VARCHAR(100)</w:t>
+            </w:r>
+          </w:p>
+        </w:tc>
+        <w:tc>
+          <w:tcPr>
+            <w:tcW w:type="dxa" w:w="1337"/>
+          </w:tcPr>
+          <w:p>
+            <w:r>
+              <w:t>Có</w:t>
+            </w:r>
+          </w:p>
+        </w:tc>
+        <w:tc>
+          <w:tcPr>
+            <w:tcW w:type="dxa" w:w="1337"/>
+          </w:tcPr>
+          <w:p>
+            <w:r/>
+          </w:p>
+        </w:tc>
+        <w:tc>
+          <w:tcPr>
+            <w:tcW w:type="dxa" w:w="1337"/>
+          </w:tcPr>
+          <w:p>
+            <w:r/>
+          </w:p>
+        </w:tc>
+        <w:tc>
+          <w:tcPr>
+            <w:tcW w:type="dxa" w:w="1337"/>
+          </w:tcPr>
+          <w:p>
+            <w:r>
+              <w:t>Dạng a@b.c nếu có</w:t>
+            </w:r>
+          </w:p>
+        </w:tc>
+      </w:tr>
+      <w:tr>
+        <w:tc>
+          <w:tcPr>
+            <w:tcW w:type="dxa" w:w="1337"/>
+          </w:tcPr>
+          <w:p>
+            <w:r>
+              <w:t>loai_nv</w:t>
+            </w:r>
+          </w:p>
+        </w:tc>
+        <w:tc>
+          <w:tcPr>
+            <w:tcW w:type="dxa" w:w="1337"/>
+          </w:tcPr>
+          <w:p>
+            <w:r>
+              <w:t>Loại nhân viên</w:t>
+            </w:r>
+          </w:p>
+        </w:tc>
+        <w:tc>
+          <w:tcPr>
+            <w:tcW w:type="dxa" w:w="1337"/>
+          </w:tcPr>
+          <w:p>
+            <w:r>
+              <w:t>VARCHAR(24)</w:t>
+            </w:r>
+          </w:p>
+        </w:tc>
+        <w:tc>
+          <w:tcPr>
+            <w:tcW w:type="dxa" w:w="1337"/>
+          </w:tcPr>
+          <w:p>
+            <w:r>
+              <w:t>Không</w:t>
+            </w:r>
+          </w:p>
+        </w:tc>
+        <w:tc>
+          <w:tcPr>
+            <w:tcW w:type="dxa" w:w="1337"/>
+          </w:tcPr>
+          <w:p>
+            <w:r/>
+          </w:p>
+        </w:tc>
+        <w:tc>
+          <w:tcPr>
+            <w:tcW w:type="dxa" w:w="1337"/>
+          </w:tcPr>
+          <w:p>
+            <w:r/>
+          </w:p>
+        </w:tc>
+        <w:tc>
+          <w:tcPr>
+            <w:tcW w:type="dxa" w:w="1337"/>
+          </w:tcPr>
+          <w:p>
+            <w:r>
+              <w:t>Miền loai_nv</w:t>
+            </w:r>
+          </w:p>
+        </w:tc>
+      </w:tr>
+    </w:tbl>
+    <w:p>
+      <w:pPr>
+        <w:pStyle w:val="Heading3"/>
+      </w:pPr>
+      <w:r>
+        <w:t>Bảng: bac_si – Thông tin giấy phép hành nghề và loại bác sĩ</w:t>
+      </w:r>
+    </w:p>
+    <w:tbl>
+      <w:tblPr>
+        <w:tblW w:type="auto" w:w="0"/>
+        <w:tblLook w:firstColumn="1" w:firstRow="1" w:lastColumn="0" w:lastRow="0" w:noHBand="0" w:noVBand="1" w:val="04A0"/>
+      </w:tblPr>
+      <w:tblGrid>
+        <w:gridCol w:w="1337"/>
+        <w:gridCol w:w="1337"/>
+        <w:gridCol w:w="1337"/>
+        <w:gridCol w:w="1337"/>
+        <w:gridCol w:w="1337"/>
+        <w:gridCol w:w="1337"/>
+        <w:gridCol w:w="1337"/>
+      </w:tblGrid>
+      <w:tr>
+        <w:tc>
+          <w:tcPr>
+            <w:tcW w:type="dxa" w:w="1337"/>
+          </w:tcPr>
+          <w:p>
+            <w:r>
+              <w:t>Cột</w:t>
+            </w:r>
+          </w:p>
+        </w:tc>
+        <w:tc>
+          <w:tcPr>
+            <w:tcW w:type="dxa" w:w="1337"/>
+          </w:tcPr>
+          <w:p>
+            <w:r>
+              <w:t>Kiểu dữ liệu</w:t>
+            </w:r>
+          </w:p>
+        </w:tc>
+        <w:tc>
+          <w:tcPr>
+            <w:tcW w:type="dxa" w:w="1337"/>
+          </w:tcPr>
+          <w:p>
+            <w:r>
+              <w:t>Null</w:t>
+            </w:r>
+          </w:p>
+        </w:tc>
+        <w:tc>
+          <w:tcPr>
+            <w:tcW w:type="dxa" w:w="1337"/>
+          </w:tcPr>
+          <w:p>
+            <w:r>
+              <w:t>Khóa</w:t>
+            </w:r>
+          </w:p>
+        </w:tc>
+        <w:tc>
+          <w:tcPr>
+            <w:tcW w:type="dxa" w:w="1337"/>
+          </w:tcPr>
+          <w:p>
+            <w:r>
+              <w:t>Mặc định</w:t>
+            </w:r>
+          </w:p>
+        </w:tc>
+        <w:tc>
+          <w:tcPr>
+            <w:tcW w:type="dxa" w:w="1337"/>
+          </w:tcPr>
+          <w:p>
+            <w:r>
+              <w:t>Ràng buộc</w:t>
+            </w:r>
+          </w:p>
+        </w:tc>
+        <w:tc>
+          <w:tcPr>
+            <w:tcW w:type="dxa" w:w="1337"/>
+          </w:tcPr>
+          <w:p>
+            <w:r>
+              <w:t>Mô tả</w:t>
+            </w:r>
+          </w:p>
+        </w:tc>
+      </w:tr>
+      <w:tr>
+        <w:tc>
+          <w:tcPr>
+            <w:tcW w:type="dxa" w:w="1337"/>
+          </w:tcPr>
+          <w:p>
+            <w:r>
+              <w:t>ma_bac_si</w:t>
+            </w:r>
+          </w:p>
+        </w:tc>
+        <w:tc>
+          <w:tcPr>
+            <w:tcW w:type="dxa" w:w="1337"/>
+          </w:tcPr>
+          <w:p>
+            <w:r>
+              <w:t>Mã bác sĩ kế thừa mã nhân viên</w:t>
+            </w:r>
+          </w:p>
+        </w:tc>
+        <w:tc>
+          <w:tcPr>
+            <w:tcW w:type="dxa" w:w="1337"/>
+          </w:tcPr>
+          <w:p>
+            <w:r>
+              <w:t>INTEGER</w:t>
+            </w:r>
+          </w:p>
+        </w:tc>
+        <w:tc>
+          <w:tcPr>
+            <w:tcW w:type="dxa" w:w="1337"/>
+          </w:tcPr>
+          <w:p>
+            <w:r>
+              <w:t>Không</w:t>
+            </w:r>
+          </w:p>
+        </w:tc>
+        <w:tc>
+          <w:tcPr>
+            <w:tcW w:type="dxa" w:w="1337"/>
+          </w:tcPr>
+          <w:p>
+            <w:r>
+              <w:t>PK, FK</w:t>
+            </w:r>
+          </w:p>
+        </w:tc>
+        <w:tc>
+          <w:tcPr>
+            <w:tcW w:type="dxa" w:w="1337"/>
+          </w:tcPr>
+          <w:p>
+            <w:r/>
+          </w:p>
+        </w:tc>
+        <w:tc>
+          <w:tcPr>
+            <w:tcW w:type="dxa" w:w="1337"/>
+          </w:tcPr>
+          <w:p>
+            <w:r>
+              <w:t>→ nhan_vien.ma_nv</w:t>
+            </w:r>
+          </w:p>
+        </w:tc>
+      </w:tr>
+      <w:tr>
+        <w:tc>
+          <w:tcPr>
+            <w:tcW w:type="dxa" w:w="1337"/>
+          </w:tcPr>
+          <w:p>
+            <w:r>
+              <w:t>so_chung_chi</w:t>
+            </w:r>
+          </w:p>
+        </w:tc>
+        <w:tc>
+          <w:tcPr>
+            <w:tcW w:type="dxa" w:w="1337"/>
+          </w:tcPr>
+          <w:p>
+            <w:r>
+              <w:t>Số giấy phép hành nghề hiện hành</w:t>
+            </w:r>
+          </w:p>
+        </w:tc>
+        <w:tc>
+          <w:tcPr>
+            <w:tcW w:type="dxa" w:w="1337"/>
+          </w:tcPr>
+          <w:p>
+            <w:r>
+              <w:t>VARCHAR(30)</w:t>
+            </w:r>
+          </w:p>
+        </w:tc>
+        <w:tc>
+          <w:tcPr>
+            <w:tcW w:type="dxa" w:w="1337"/>
+          </w:tcPr>
+          <w:p>
+            <w:r>
+              <w:t>Không</w:t>
+            </w:r>
+          </w:p>
+        </w:tc>
+        <w:tc>
+          <w:tcPr>
+            <w:tcW w:type="dxa" w:w="1337"/>
+          </w:tcPr>
+          <w:p>
+            <w:r>
+              <w:t>UNIQUE</w:t>
+            </w:r>
+          </w:p>
+        </w:tc>
+        <w:tc>
+          <w:tcPr>
+            <w:tcW w:type="dxa" w:w="1337"/>
+          </w:tcPr>
+          <w:p>
+            <w:r/>
+          </w:p>
+        </w:tc>
+        <w:tc>
+          <w:tcPr>
+            <w:tcW w:type="dxa" w:w="1337"/>
+          </w:tcPr>
+          <w:p>
+            <w:r>
+              <w:t>Không rỗng</w:t>
+            </w:r>
+          </w:p>
+        </w:tc>
+      </w:tr>
+      <w:tr>
+        <w:tc>
+          <w:tcPr>
+            <w:tcW w:type="dxa" w:w="1337"/>
+          </w:tcPr>
+          <w:p>
+            <w:r>
+              <w:t>ngay_cap_cc</w:t>
+            </w:r>
+          </w:p>
+        </w:tc>
+        <w:tc>
+          <w:tcPr>
+            <w:tcW w:type="dxa" w:w="1337"/>
+          </w:tcPr>
+          <w:p>
+            <w:r>
+              <w:t>Ngày cấp giấy phép</w:t>
+            </w:r>
+          </w:p>
+        </w:tc>
+        <w:tc>
+          <w:tcPr>
+            <w:tcW w:type="dxa" w:w="1337"/>
+          </w:tcPr>
+          <w:p>
+            <w:r>
+              <w:t>DATE</w:t>
+            </w:r>
+          </w:p>
+        </w:tc>
+        <w:tc>
+          <w:tcPr>
+            <w:tcW w:type="dxa" w:w="1337"/>
+          </w:tcPr>
+          <w:p>
+            <w:r>
+              <w:t>Không</w:t>
+            </w:r>
+          </w:p>
+        </w:tc>
+        <w:tc>
+          <w:tcPr>
+            <w:tcW w:type="dxa" w:w="1337"/>
+          </w:tcPr>
+          <w:p>
+            <w:r/>
+          </w:p>
+        </w:tc>
+        <w:tc>
+          <w:tcPr>
+            <w:tcW w:type="dxa" w:w="1337"/>
+          </w:tcPr>
+          <w:p>
+            <w:r/>
+          </w:p>
+        </w:tc>
+        <w:tc>
+          <w:tcPr>
+            <w:tcW w:type="dxa" w:w="1337"/>
+          </w:tcPr>
+          <w:p>
+            <w:r>
+              <w:t>&lt; ngay_het_han_cc</w:t>
+            </w:r>
+          </w:p>
+        </w:tc>
+      </w:tr>
+      <w:tr>
+        <w:tc>
+          <w:tcPr>
+            <w:tcW w:type="dxa" w:w="1337"/>
+          </w:tcPr>
+          <w:p>
+            <w:r>
+              <w:t>ngay_het_han_cc</w:t>
+            </w:r>
+          </w:p>
+        </w:tc>
+        <w:tc>
+          <w:tcPr>
+            <w:tcW w:type="dxa" w:w="1337"/>
+          </w:tcPr>
+          <w:p>
+            <w:r>
+              <w:t>Ngày hết hạn giấy phép</w:t>
+            </w:r>
+          </w:p>
+        </w:tc>
+        <w:tc>
+          <w:tcPr>
+            <w:tcW w:type="dxa" w:w="1337"/>
+          </w:tcPr>
+          <w:p>
+            <w:r>
+              <w:t>DATE</w:t>
+            </w:r>
+          </w:p>
+        </w:tc>
+        <w:tc>
+          <w:tcPr>
+            <w:tcW w:type="dxa" w:w="1337"/>
+          </w:tcPr>
+          <w:p>
+            <w:r>
+              <w:t>Không</w:t>
+            </w:r>
+          </w:p>
+        </w:tc>
+        <w:tc>
+          <w:tcPr>
+            <w:tcW w:type="dxa" w:w="1337"/>
+          </w:tcPr>
+          <w:p>
+            <w:r/>
+          </w:p>
+        </w:tc>
+        <w:tc>
+          <w:tcPr>
+            <w:tcW w:type="dxa" w:w="1337"/>
+          </w:tcPr>
+          <w:p>
+            <w:r/>
+          </w:p>
+        </w:tc>
+        <w:tc>
+          <w:tcPr>
+            <w:tcW w:type="dxa" w:w="1337"/>
+          </w:tcPr>
+          <w:p>
+            <w:r>
+              <w:t>&gt; ngay_cap_cc; bao trùm ngày ca</w:t>
+            </w:r>
+          </w:p>
+        </w:tc>
+      </w:tr>
+      <w:tr>
+        <w:tc>
+          <w:tcPr>
+            <w:tcW w:type="dxa" w:w="1337"/>
+          </w:tcPr>
+          <w:p>
+            <w:r>
+              <w:t>loai_bac_si</w:t>
+            </w:r>
+          </w:p>
+        </w:tc>
+        <w:tc>
+          <w:tcPr>
+            <w:tcW w:type="dxa" w:w="1337"/>
+          </w:tcPr>
+          <w:p>
+            <w:r>
+              <w:t>Phân loại bác sĩ</w:t>
+            </w:r>
+          </w:p>
+        </w:tc>
+        <w:tc>
+          <w:tcPr>
+            <w:tcW w:type="dxa" w:w="1337"/>
+          </w:tcPr>
+          <w:p>
+            <w:r>
+              <w:t>VARCHAR(16)</w:t>
+            </w:r>
+          </w:p>
+        </w:tc>
+        <w:tc>
+          <w:tcPr>
+            <w:tcW w:type="dxa" w:w="1337"/>
+          </w:tcPr>
+          <w:p>
+            <w:r>
+              <w:t>Không</w:t>
+            </w:r>
+          </w:p>
+        </w:tc>
+        <w:tc>
+          <w:tcPr>
+            <w:tcW w:type="dxa" w:w="1337"/>
+          </w:tcPr>
+          <w:p>
+            <w:r/>
+          </w:p>
+        </w:tc>
+        <w:tc>
+          <w:tcPr>
+            <w:tcW w:type="dxa" w:w="1337"/>
+          </w:tcPr>
+          <w:p>
+            <w:r/>
+          </w:p>
+        </w:tc>
+        <w:tc>
+          <w:tcPr>
+            <w:tcW w:type="dxa" w:w="1337"/>
+          </w:tcPr>
+          <w:p>
+            <w:r>
+              <w:t>DA_KHOA, CHUYEN_KHOA</w:t>
+            </w:r>
+          </w:p>
+        </w:tc>
+      </w:tr>
+    </w:tbl>
+    <w:p>
+      <w:pPr>
+        <w:pStyle w:val="Heading3"/>
+      </w:pPr>
+      <w:r>
+        <w:t>Bảng: bac_si_da_khoa – Lớp con bác sĩ đa khoa</w:t>
+      </w:r>
+    </w:p>
+    <w:tbl>
+      <w:tblPr>
+        <w:tblW w:type="auto" w:w="0"/>
+        <w:tblLook w:firstColumn="1" w:firstRow="1" w:lastColumn="0" w:lastRow="0" w:noHBand="0" w:noVBand="1" w:val="04A0"/>
+      </w:tblPr>
+      <w:tblGrid>
+        <w:gridCol w:w="1337"/>
+        <w:gridCol w:w="1337"/>
+        <w:gridCol w:w="1337"/>
+        <w:gridCol w:w="1337"/>
+        <w:gridCol w:w="1337"/>
+        <w:gridCol w:w="1337"/>
+        <w:gridCol w:w="1337"/>
+      </w:tblGrid>
+      <w:tr>
+        <w:tc>
+          <w:tcPr>
+            <w:tcW w:type="dxa" w:w="1337"/>
+          </w:tcPr>
+          <w:p>
+            <w:r>
+              <w:t>Cột</w:t>
+            </w:r>
+          </w:p>
+        </w:tc>
+        <w:tc>
+          <w:tcPr>
+            <w:tcW w:type="dxa" w:w="1337"/>
+          </w:tcPr>
+          <w:p>
+            <w:r>
+              <w:t>Kiểu dữ liệu</w:t>
+            </w:r>
+          </w:p>
+        </w:tc>
+        <w:tc>
+          <w:tcPr>
+            <w:tcW w:type="dxa" w:w="1337"/>
+          </w:tcPr>
+          <w:p>
+            <w:r>
+              <w:t>Null</w:t>
+            </w:r>
+          </w:p>
+        </w:tc>
+        <w:tc>
+          <w:tcPr>
+            <w:tcW w:type="dxa" w:w="1337"/>
+          </w:tcPr>
+          <w:p>
+            <w:r>
+              <w:t>Khóa</w:t>
+            </w:r>
+          </w:p>
+        </w:tc>
+        <w:tc>
+          <w:tcPr>
+            <w:tcW w:type="dxa" w:w="1337"/>
+          </w:tcPr>
+          <w:p>
+            <w:r>
+              <w:t>Mặc định</w:t>
+            </w:r>
+          </w:p>
+        </w:tc>
+        <w:tc>
+          <w:tcPr>
+            <w:tcW w:type="dxa" w:w="1337"/>
+          </w:tcPr>
+          <w:p>
+            <w:r>
+              <w:t>Ràng buộc</w:t>
+            </w:r>
+          </w:p>
+        </w:tc>
+        <w:tc>
+          <w:tcPr>
+            <w:tcW w:type="dxa" w:w="1337"/>
+          </w:tcPr>
+          <w:p>
+            <w:r>
+              <w:t>Mô tả</w:t>
+            </w:r>
+          </w:p>
+        </w:tc>
+      </w:tr>
+      <w:tr>
+        <w:tc>
+          <w:tcPr>
+            <w:tcW w:type="dxa" w:w="1337"/>
+          </w:tcPr>
+          <w:p>
+            <w:r>
+              <w:t>ma_bac_si</w:t>
+            </w:r>
+          </w:p>
+        </w:tc>
+        <w:tc>
+          <w:tcPr>
+            <w:tcW w:type="dxa" w:w="1337"/>
+          </w:tcPr>
+          <w:p>
+            <w:r>
+              <w:t>Bác sĩ thuộc lớp đa khoa</w:t>
+            </w:r>
+          </w:p>
+        </w:tc>
+        <w:tc>
+          <w:tcPr>
+            <w:tcW w:type="dxa" w:w="1337"/>
+          </w:tcPr>
+          <w:p>
+            <w:r>
+              <w:t>INTEGER</w:t>
+            </w:r>
+          </w:p>
+        </w:tc>
+        <w:tc>
+          <w:tcPr>
+            <w:tcW w:type="dxa" w:w="1337"/>
+          </w:tcPr>
+          <w:p>
+            <w:r>
+              <w:t>Không</w:t>
+            </w:r>
+          </w:p>
+        </w:tc>
+        <w:tc>
+          <w:tcPr>
+            <w:tcW w:type="dxa" w:w="1337"/>
+          </w:tcPr>
+          <w:p>
+            <w:r>
+              <w:t>PK, FK</w:t>
+            </w:r>
+          </w:p>
+        </w:tc>
+        <w:tc>
+          <w:tcPr>
+            <w:tcW w:type="dxa" w:w="1337"/>
+          </w:tcPr>
+          <w:p>
+            <w:r/>
+          </w:p>
+        </w:tc>
+        <w:tc>
+          <w:tcPr>
+            <w:tcW w:type="dxa" w:w="1337"/>
+          </w:tcPr>
+          <w:p>
+            <w:r>
+              <w:t>→ bac_si.ma_bac_si</w:t>
+            </w:r>
+          </w:p>
+        </w:tc>
+      </w:tr>
+    </w:tbl>
+    <w:p>
+      <w:pPr>
+        <w:pStyle w:val="Heading3"/>
+      </w:pPr>
+      <w:r>
+        <w:t>Bảng: bac_si_chuyen_khoa – Lớp con bác sĩ chuyên khoa và chuyên khoa phụ trách</w:t>
+      </w:r>
+    </w:p>
+    <w:tbl>
+      <w:tblPr>
+        <w:tblW w:type="auto" w:w="0"/>
+        <w:tblLook w:firstColumn="1" w:firstRow="1" w:lastColumn="0" w:lastRow="0" w:noHBand="0" w:noVBand="1" w:val="04A0"/>
+      </w:tblPr>
+      <w:tblGrid>
+        <w:gridCol w:w="1337"/>
+        <w:gridCol w:w="1337"/>
+        <w:gridCol w:w="1337"/>
+        <w:gridCol w:w="1337"/>
+        <w:gridCol w:w="1337"/>
+        <w:gridCol w:w="1337"/>
+        <w:gridCol w:w="1337"/>
+      </w:tblGrid>
+      <w:tr>
+        <w:tc>
+          <w:tcPr>
+            <w:tcW w:type="dxa" w:w="1337"/>
+          </w:tcPr>
+          <w:p>
+            <w:r>
+              <w:t>Cột</w:t>
+            </w:r>
+          </w:p>
+        </w:tc>
+        <w:tc>
+          <w:tcPr>
+            <w:tcW w:type="dxa" w:w="1337"/>
+          </w:tcPr>
+          <w:p>
+            <w:r>
+              <w:t>Kiểu dữ liệu</w:t>
+            </w:r>
+          </w:p>
+        </w:tc>
+        <w:tc>
+          <w:tcPr>
+            <w:tcW w:type="dxa" w:w="1337"/>
+          </w:tcPr>
+          <w:p>
+            <w:r>
+              <w:t>Null</w:t>
+            </w:r>
+          </w:p>
+        </w:tc>
+        <w:tc>
+          <w:tcPr>
+            <w:tcW w:type="dxa" w:w="1337"/>
+          </w:tcPr>
+          <w:p>
+            <w:r>
+              <w:t>Khóa</w:t>
+            </w:r>
+          </w:p>
+        </w:tc>
+        <w:tc>
+          <w:tcPr>
+            <w:tcW w:type="dxa" w:w="1337"/>
+          </w:tcPr>
+          <w:p>
+            <w:r>
+              <w:t>Mặc định</w:t>
+            </w:r>
+          </w:p>
+        </w:tc>
+        <w:tc>
+          <w:tcPr>
+            <w:tcW w:type="dxa" w:w="1337"/>
+          </w:tcPr>
+          <w:p>
+            <w:r>
+              <w:t>Ràng buộc</w:t>
+            </w:r>
+          </w:p>
+        </w:tc>
+        <w:tc>
+          <w:tcPr>
+            <w:tcW w:type="dxa" w:w="1337"/>
+          </w:tcPr>
+          <w:p>
+            <w:r>
+              <w:t>Mô tả</w:t>
+            </w:r>
+          </w:p>
+        </w:tc>
+      </w:tr>
+      <w:tr>
+        <w:tc>
+          <w:tcPr>
+            <w:tcW w:type="dxa" w:w="1337"/>
+          </w:tcPr>
+          <w:p>
+            <w:r>
+              <w:t>ma_bac_si</w:t>
+            </w:r>
+          </w:p>
+        </w:tc>
+        <w:tc>
+          <w:tcPr>
+            <w:tcW w:type="dxa" w:w="1337"/>
+          </w:tcPr>
+          <w:p>
+            <w:r>
+              <w:t>Bác sĩ thuộc lớp chuyên khoa</w:t>
+            </w:r>
+          </w:p>
+        </w:tc>
+        <w:tc>
+          <w:tcPr>
+            <w:tcW w:type="dxa" w:w="1337"/>
+          </w:tcPr>
+          <w:p>
+            <w:r>
+              <w:t>INTEGER</w:t>
+            </w:r>
+          </w:p>
+        </w:tc>
+        <w:tc>
+          <w:tcPr>
+            <w:tcW w:type="dxa" w:w="1337"/>
+          </w:tcPr>
+          <w:p>
+            <w:r>
+              <w:t>Không</w:t>
+            </w:r>
+          </w:p>
+        </w:tc>
+        <w:tc>
+          <w:tcPr>
+            <w:tcW w:type="dxa" w:w="1337"/>
+          </w:tcPr>
+          <w:p>
+            <w:r>
+              <w:t>PK, FK</w:t>
+            </w:r>
+          </w:p>
+        </w:tc>
+        <w:tc>
+          <w:tcPr>
+            <w:tcW w:type="dxa" w:w="1337"/>
+          </w:tcPr>
+          <w:p>
+            <w:r/>
+          </w:p>
+        </w:tc>
+        <w:tc>
+          <w:tcPr>
+            <w:tcW w:type="dxa" w:w="1337"/>
+          </w:tcPr>
+          <w:p>
+            <w:r>
+              <w:t>→ bac_si.ma_bac_si</w:t>
+            </w:r>
+          </w:p>
+        </w:tc>
+      </w:tr>
+      <w:tr>
+        <w:tc>
+          <w:tcPr>
+            <w:tcW w:type="dxa" w:w="1337"/>
+          </w:tcPr>
+          <w:p>
+            <w:r>
+              <w:t>ma_chuyen_khoa</w:t>
+            </w:r>
+          </w:p>
+        </w:tc>
+        <w:tc>
+          <w:tcPr>
+            <w:tcW w:type="dxa" w:w="1337"/>
+          </w:tcPr>
+          <w:p>
+            <w:r>
+              <w:t>Chuyên khoa duy nhất của bác sĩ</w:t>
+            </w:r>
+          </w:p>
+        </w:tc>
+        <w:tc>
+          <w:tcPr>
+            <w:tcW w:type="dxa" w:w="1337"/>
+          </w:tcPr>
+          <w:p>
+            <w:r>
+              <w:t>INTEGER</w:t>
+            </w:r>
+          </w:p>
+        </w:tc>
+        <w:tc>
+          <w:tcPr>
+            <w:tcW w:type="dxa" w:w="1337"/>
+          </w:tcPr>
+          <w:p>
+            <w:r>
+              <w:t>Không</w:t>
+            </w:r>
+          </w:p>
+        </w:tc>
+        <w:tc>
+          <w:tcPr>
+            <w:tcW w:type="dxa" w:w="1337"/>
+          </w:tcPr>
+          <w:p>
+            <w:r>
+              <w:t>FK</w:t>
+            </w:r>
+          </w:p>
+        </w:tc>
+        <w:tc>
+          <w:tcPr>
+            <w:tcW w:type="dxa" w:w="1337"/>
+          </w:tcPr>
+          <w:p>
+            <w:r/>
+          </w:p>
+        </w:tc>
+        <w:tc>
+          <w:tcPr>
+            <w:tcW w:type="dxa" w:w="1337"/>
+          </w:tcPr>
+          <w:p>
+            <w:r>
+              <w:t>→ chuyen_khoa.ma_chuyen_khoa</w:t>
+            </w:r>
+          </w:p>
+        </w:tc>
+      </w:tr>
+    </w:tbl>
+    <w:p>
+      <w:pPr>
+        <w:pStyle w:val="Heading3"/>
+      </w:pPr>
+      <w:r>
+        <w:t>Bảng: chuyen_khoa – Danh mục các lĩnh vực chuyên sâu</w:t>
+      </w:r>
+    </w:p>
+    <w:tbl>
+      <w:tblPr>
+        <w:tblW w:type="auto" w:w="0"/>
+        <w:tblLook w:firstColumn="1" w:firstRow="1" w:lastColumn="0" w:lastRow="0" w:noHBand="0" w:noVBand="1" w:val="04A0"/>
+      </w:tblPr>
+      <w:tblGrid>
+        <w:gridCol w:w="1337"/>
+        <w:gridCol w:w="1337"/>
+        <w:gridCol w:w="1337"/>
+        <w:gridCol w:w="1337"/>
+        <w:gridCol w:w="1337"/>
+        <w:gridCol w:w="1337"/>
+        <w:gridCol w:w="1337"/>
+      </w:tblGrid>
+      <w:tr>
+        <w:tc>
+          <w:tcPr>
+            <w:tcW w:type="dxa" w:w="1337"/>
+          </w:tcPr>
+          <w:p>
+            <w:r>
+              <w:t>Cột</w:t>
+            </w:r>
+          </w:p>
+        </w:tc>
+        <w:tc>
+          <w:tcPr>
+            <w:tcW w:type="dxa" w:w="1337"/>
+          </w:tcPr>
+          <w:p>
+            <w:r>
+              <w:t>Kiểu dữ liệu</w:t>
+            </w:r>
+          </w:p>
+        </w:tc>
+        <w:tc>
+          <w:tcPr>
+            <w:tcW w:type="dxa" w:w="1337"/>
+          </w:tcPr>
+          <w:p>
+            <w:r>
+              <w:t>Null</w:t>
+            </w:r>
+          </w:p>
+        </w:tc>
+        <w:tc>
+          <w:tcPr>
+            <w:tcW w:type="dxa" w:w="1337"/>
+          </w:tcPr>
+          <w:p>
+            <w:r>
+              <w:t>Khóa</w:t>
+            </w:r>
+          </w:p>
+        </w:tc>
+        <w:tc>
+          <w:tcPr>
+            <w:tcW w:type="dxa" w:w="1337"/>
+          </w:tcPr>
+          <w:p>
+            <w:r>
+              <w:t>Mặc định</w:t>
+            </w:r>
+          </w:p>
+        </w:tc>
+        <w:tc>
+          <w:tcPr>
+            <w:tcW w:type="dxa" w:w="1337"/>
+          </w:tcPr>
+          <w:p>
+            <w:r>
+              <w:t>Ràng buộc</w:t>
+            </w:r>
+          </w:p>
+        </w:tc>
+        <w:tc>
+          <w:tcPr>
+            <w:tcW w:type="dxa" w:w="1337"/>
+          </w:tcPr>
+          <w:p>
+            <w:r>
+              <w:t>Mô tả</w:t>
+            </w:r>
+          </w:p>
+        </w:tc>
+      </w:tr>
+      <w:tr>
+        <w:tc>
+          <w:tcPr>
+            <w:tcW w:type="dxa" w:w="1337"/>
+          </w:tcPr>
+          <w:p>
+            <w:r>
+              <w:t>ma_chuyen_khoa</w:t>
+            </w:r>
+          </w:p>
+        </w:tc>
+        <w:tc>
+          <w:tcPr>
+            <w:tcW w:type="dxa" w:w="1337"/>
+          </w:tcPr>
+          <w:p>
+            <w:r>
+              <w:t>Mã chuyên khoa</w:t>
+            </w:r>
+          </w:p>
+        </w:tc>
+        <w:tc>
+          <w:tcPr>
+            <w:tcW w:type="dxa" w:w="1337"/>
+          </w:tcPr>
+          <w:p>
+            <w:r>
+              <w:t>INTEGER identity</w:t>
+            </w:r>
+          </w:p>
+        </w:tc>
+        <w:tc>
+          <w:tcPr>
+            <w:tcW w:type="dxa" w:w="1337"/>
+          </w:tcPr>
+          <w:p>
+            <w:r>
+              <w:t>Không</w:t>
+            </w:r>
+          </w:p>
+        </w:tc>
+        <w:tc>
+          <w:tcPr>
+            <w:tcW w:type="dxa" w:w="1337"/>
+          </w:tcPr>
+          <w:p>
+            <w:r>
+              <w:t>PK</w:t>
+            </w:r>
+          </w:p>
+        </w:tc>
+        <w:tc>
+          <w:tcPr>
+            <w:tcW w:type="dxa" w:w="1337"/>
+          </w:tcPr>
+          <w:p>
+            <w:r>
+              <w:t>Tự tăng</w:t>
+            </w:r>
+          </w:p>
+        </w:tc>
+        <w:tc>
+          <w:tcPr>
+            <w:tcW w:type="dxa" w:w="1337"/>
+          </w:tcPr>
+          <w:p>
+            <w:r>
+              <w:t>Duy nhất</w:t>
+            </w:r>
+          </w:p>
+        </w:tc>
+      </w:tr>
+      <w:tr>
+        <w:tc>
+          <w:tcPr>
+            <w:tcW w:type="dxa" w:w="1337"/>
+          </w:tcPr>
+          <w:p>
+            <w:r>
+              <w:t>ten_chuyen_khoa</w:t>
+            </w:r>
+          </w:p>
+        </w:tc>
+        <w:tc>
+          <w:tcPr>
+            <w:tcW w:type="dxa" w:w="1337"/>
+          </w:tcPr>
+          <w:p>
+            <w:r>
+              <w:t>Tên chuyên khoa</w:t>
+            </w:r>
+          </w:p>
+        </w:tc>
+        <w:tc>
+          <w:tcPr>
+            <w:tcW w:type="dxa" w:w="1337"/>
+          </w:tcPr>
+          <w:p>
+            <w:r>
+              <w:t>VARCHAR(100)</w:t>
+            </w:r>
+          </w:p>
+        </w:tc>
+        <w:tc>
+          <w:tcPr>
+            <w:tcW w:type="dxa" w:w="1337"/>
+          </w:tcPr>
+          <w:p>
+            <w:r>
+              <w:t>Không</w:t>
+            </w:r>
+          </w:p>
+        </w:tc>
+        <w:tc>
+          <w:tcPr>
+            <w:tcW w:type="dxa" w:w="1337"/>
+          </w:tcPr>
+          <w:p>
+            <w:r>
+              <w:t>UNIQUE</w:t>
+            </w:r>
+          </w:p>
+        </w:tc>
+        <w:tc>
+          <w:tcPr>
+            <w:tcW w:type="dxa" w:w="1337"/>
+          </w:tcPr>
+          <w:p>
+            <w:r/>
+          </w:p>
+        </w:tc>
+        <w:tc>
+          <w:tcPr>
+            <w:tcW w:type="dxa" w:w="1337"/>
+          </w:tcPr>
+          <w:p>
+            <w:r>
+              <w:t>Không rỗng</w:t>
+            </w:r>
+          </w:p>
+        </w:tc>
+      </w:tr>
+    </w:tbl>
+    <w:p>
+      <w:pPr>
+        <w:pStyle w:val="Heading3"/>
+      </w:pPr>
+      <w:r>
+        <w:t>Bảng: ca_lam_viec – Ca làm việc được xếp cho bác sĩ</w:t>
+      </w:r>
+    </w:p>
+    <w:tbl>
+      <w:tblPr>
+        <w:tblW w:type="auto" w:w="0"/>
+        <w:tblLook w:firstColumn="1" w:firstRow="1" w:lastColumn="0" w:lastRow="0" w:noHBand="0" w:noVBand="1" w:val="04A0"/>
+      </w:tblPr>
+      <w:tblGrid>
+        <w:gridCol w:w="1337"/>
+        <w:gridCol w:w="1337"/>
+        <w:gridCol w:w="1337"/>
+        <w:gridCol w:w="1337"/>
+        <w:gridCol w:w="1337"/>
+        <w:gridCol w:w="1337"/>
+        <w:gridCol w:w="1337"/>
+      </w:tblGrid>
+      <w:tr>
+        <w:tc>
+          <w:tcPr>
+            <w:tcW w:type="dxa" w:w="1337"/>
+          </w:tcPr>
+          <w:p>
+            <w:r>
+              <w:t>Cột</w:t>
+            </w:r>
+          </w:p>
+        </w:tc>
+        <w:tc>
+          <w:tcPr>
+            <w:tcW w:type="dxa" w:w="1337"/>
+          </w:tcPr>
+          <w:p>
+            <w:r>
+              <w:t>Kiểu dữ liệu</w:t>
+            </w:r>
+          </w:p>
+        </w:tc>
+        <w:tc>
+          <w:tcPr>
+            <w:tcW w:type="dxa" w:w="1337"/>
+          </w:tcPr>
+          <w:p>
+            <w:r>
+              <w:t>Null</w:t>
+            </w:r>
+          </w:p>
+        </w:tc>
+        <w:tc>
+          <w:tcPr>
+            <w:tcW w:type="dxa" w:w="1337"/>
+          </w:tcPr>
+          <w:p>
+            <w:r>
+              <w:t>Khóa</w:t>
+            </w:r>
+          </w:p>
+        </w:tc>
+        <w:tc>
+          <w:tcPr>
+            <w:tcW w:type="dxa" w:w="1337"/>
+          </w:tcPr>
+          <w:p>
+            <w:r>
+              <w:t>Mặc định</w:t>
+            </w:r>
+          </w:p>
+        </w:tc>
+        <w:tc>
+          <w:tcPr>
+            <w:tcW w:type="dxa" w:w="1337"/>
+          </w:tcPr>
+          <w:p>
+            <w:r>
+              <w:t>Ràng buộc</w:t>
+            </w:r>
+          </w:p>
+        </w:tc>
+        <w:tc>
+          <w:tcPr>
+            <w:tcW w:type="dxa" w:w="1337"/>
+          </w:tcPr>
+          <w:p>
+            <w:r>
+              <w:t>Mô tả</w:t>
+            </w:r>
+          </w:p>
+        </w:tc>
+      </w:tr>
+      <w:tr>
+        <w:tc>
+          <w:tcPr>
+            <w:tcW w:type="dxa" w:w="1337"/>
+          </w:tcPr>
+          <w:p>
+            <w:r>
+              <w:t>ma_ca</w:t>
+            </w:r>
+          </w:p>
+        </w:tc>
+        <w:tc>
+          <w:tcPr>
+            <w:tcW w:type="dxa" w:w="1337"/>
+          </w:tcPr>
+          <w:p>
+            <w:r>
+              <w:t>Mã ca làm việc</w:t>
+            </w:r>
+          </w:p>
+        </w:tc>
+        <w:tc>
+          <w:tcPr>
+            <w:tcW w:type="dxa" w:w="1337"/>
+          </w:tcPr>
+          <w:p>
+            <w:r>
+              <w:t>INTEGER identity</w:t>
+            </w:r>
+          </w:p>
+        </w:tc>
+        <w:tc>
+          <w:tcPr>
+            <w:tcW w:type="dxa" w:w="1337"/>
+          </w:tcPr>
+          <w:p>
+            <w:r>
+              <w:t>Không</w:t>
+            </w:r>
+          </w:p>
+        </w:tc>
+        <w:tc>
+          <w:tcPr>
+            <w:tcW w:type="dxa" w:w="1337"/>
+          </w:tcPr>
+          <w:p>
+            <w:r>
+              <w:t>PK</w:t>
+            </w:r>
+          </w:p>
+        </w:tc>
+        <w:tc>
+          <w:tcPr>
+            <w:tcW w:type="dxa" w:w="1337"/>
+          </w:tcPr>
+          <w:p>
+            <w:r>
+              <w:t>Tự tăng</w:t>
+            </w:r>
+          </w:p>
+        </w:tc>
+        <w:tc>
+          <w:tcPr>
+            <w:tcW w:type="dxa" w:w="1337"/>
+          </w:tcPr>
+          <w:p>
+            <w:r>
+              <w:t>Duy nhất</w:t>
+            </w:r>
+          </w:p>
+        </w:tc>
+      </w:tr>
+      <w:tr>
+        <w:tc>
+          <w:tcPr>
+            <w:tcW w:type="dxa" w:w="1337"/>
+          </w:tcPr>
+          <w:p>
+            <w:r>
+              <w:t>thoi_gian_bd</w:t>
+            </w:r>
+          </w:p>
+        </w:tc>
+        <w:tc>
+          <w:tcPr>
+            <w:tcW w:type="dxa" w:w="1337"/>
+          </w:tcPr>
+          <w:p>
+            <w:r>
+              <w:t>Thời điểm bắt đầu</w:t>
+            </w:r>
+          </w:p>
+        </w:tc>
+        <w:tc>
+          <w:tcPr>
+            <w:tcW w:type="dxa" w:w="1337"/>
+          </w:tcPr>
+          <w:p>
+            <w:r>
+              <w:t>TIMESTAMP</w:t>
+            </w:r>
+          </w:p>
+        </w:tc>
+        <w:tc>
+          <w:tcPr>
+            <w:tcW w:type="dxa" w:w="1337"/>
+          </w:tcPr>
+          <w:p>
+            <w:r>
+              <w:t>Không</w:t>
+            </w:r>
+          </w:p>
+        </w:tc>
+        <w:tc>
+          <w:tcPr>
+            <w:tcW w:type="dxa" w:w="1337"/>
+          </w:tcPr>
+          <w:p>
+            <w:r/>
+          </w:p>
+        </w:tc>
+        <w:tc>
+          <w:tcPr>
+            <w:tcW w:type="dxa" w:w="1337"/>
+          </w:tcPr>
+          <w:p>
+            <w:r/>
+          </w:p>
+        </w:tc>
+        <w:tc>
+          <w:tcPr>
+            <w:tcW w:type="dxa" w:w="1337"/>
+          </w:tcPr>
+          <w:p>
+            <w:r>
+              <w:t>&lt; thoi_gian_kt</w:t>
+            </w:r>
+          </w:p>
+        </w:tc>
+      </w:tr>
+      <w:tr>
+        <w:tc>
+          <w:tcPr>
+            <w:tcW w:type="dxa" w:w="1337"/>
+          </w:tcPr>
+          <w:p>
+            <w:r>
+              <w:t>thoi_gian_kt</w:t>
+            </w:r>
+          </w:p>
+        </w:tc>
+        <w:tc>
+          <w:tcPr>
+            <w:tcW w:type="dxa" w:w="1337"/>
+          </w:tcPr>
+          <w:p>
+            <w:r>
+              <w:t>Thời điểm kết thúc</w:t>
+            </w:r>
+          </w:p>
+        </w:tc>
+        <w:tc>
+          <w:tcPr>
+            <w:tcW w:type="dxa" w:w="1337"/>
+          </w:tcPr>
+          <w:p>
+            <w:r>
+              <w:t>TIMESTAMP</w:t>
+            </w:r>
+          </w:p>
+        </w:tc>
+        <w:tc>
+          <w:tcPr>
+            <w:tcW w:type="dxa" w:w="1337"/>
+          </w:tcPr>
+          <w:p>
+            <w:r>
+              <w:t>Không</w:t>
+            </w:r>
+          </w:p>
+        </w:tc>
+        <w:tc>
+          <w:tcPr>
+            <w:tcW w:type="dxa" w:w="1337"/>
+          </w:tcPr>
+          <w:p>
+            <w:r/>
+          </w:p>
+        </w:tc>
+        <w:tc>
+          <w:tcPr>
+            <w:tcW w:type="dxa" w:w="1337"/>
+          </w:tcPr>
+          <w:p>
+            <w:r/>
+          </w:p>
+        </w:tc>
+        <w:tc>
+          <w:tcPr>
+            <w:tcW w:type="dxa" w:w="1337"/>
+          </w:tcPr>
+          <w:p>
+            <w:r>
+              <w:t>&gt; thoi_gian_bd</w:t>
+            </w:r>
+          </w:p>
+        </w:tc>
+      </w:tr>
+      <w:tr>
+        <w:tc>
+          <w:tcPr>
+            <w:tcW w:type="dxa" w:w="1337"/>
+          </w:tcPr>
+          <w:p>
+            <w:r>
+              <w:t>trang_thai</w:t>
+            </w:r>
+          </w:p>
+        </w:tc>
+        <w:tc>
+          <w:tcPr>
+            <w:tcW w:type="dxa" w:w="1337"/>
+          </w:tcPr>
+          <w:p>
+            <w:r>
+              <w:t>Trạng thái ca</w:t>
+            </w:r>
+          </w:p>
+        </w:tc>
+        <w:tc>
+          <w:tcPr>
+            <w:tcW w:type="dxa" w:w="1337"/>
+          </w:tcPr>
+          <w:p>
+            <w:r>
+              <w:t>VARCHAR(8)</w:t>
+            </w:r>
+          </w:p>
+        </w:tc>
+        <w:tc>
+          <w:tcPr>
+            <w:tcW w:type="dxa" w:w="1337"/>
+          </w:tcPr>
+          <w:p>
+            <w:r>
+              <w:t>Không</w:t>
+            </w:r>
+          </w:p>
+        </w:tc>
+        <w:tc>
+          <w:tcPr>
+            <w:tcW w:type="dxa" w:w="1337"/>
+          </w:tcPr>
+          <w:p>
+            <w:r/>
+          </w:p>
+        </w:tc>
+        <w:tc>
+          <w:tcPr>
+            <w:tcW w:type="dxa" w:w="1337"/>
+          </w:tcPr>
+          <w:p>
+            <w:r>
+              <w:t>DA_XEP</w:t>
+            </w:r>
+          </w:p>
+        </w:tc>
+        <w:tc>
+          <w:tcPr>
+            <w:tcW w:type="dxa" w:w="1337"/>
+          </w:tcPr>
+          <w:p>
+            <w:r>
+              <w:t>DA_XEP, HUY</w:t>
+            </w:r>
+          </w:p>
+        </w:tc>
+      </w:tr>
+      <w:tr>
+        <w:tc>
+          <w:tcPr>
+            <w:tcW w:type="dxa" w:w="1337"/>
+          </w:tcPr>
+          <w:p>
+            <w:r>
+              <w:t>ma_bac_si</w:t>
+            </w:r>
+          </w:p>
+        </w:tc>
+        <w:tc>
+          <w:tcPr>
+            <w:tcW w:type="dxa" w:w="1337"/>
+          </w:tcPr>
+          <w:p>
+            <w:r>
+              <w:t>Bác sĩ được xếp ca</w:t>
+            </w:r>
+          </w:p>
+        </w:tc>
+        <w:tc>
+          <w:tcPr>
+            <w:tcW w:type="dxa" w:w="1337"/>
+          </w:tcPr>
+          <w:p>
+            <w:r>
+              <w:t>INTEGER</w:t>
+            </w:r>
+          </w:p>
+        </w:tc>
+        <w:tc>
+          <w:tcPr>
+            <w:tcW w:type="dxa" w:w="1337"/>
+          </w:tcPr>
+          <w:p>
+            <w:r>
+              <w:t>Không</w:t>
+            </w:r>
+          </w:p>
+        </w:tc>
+        <w:tc>
+          <w:tcPr>
+            <w:tcW w:type="dxa" w:w="1337"/>
+          </w:tcPr>
+          <w:p>
+            <w:r>
+              <w:t>FK</w:t>
+            </w:r>
+          </w:p>
+        </w:tc>
+        <w:tc>
+          <w:tcPr>
+            <w:tcW w:type="dxa" w:w="1337"/>
+          </w:tcPr>
+          <w:p>
+            <w:r/>
+          </w:p>
+        </w:tc>
+        <w:tc>
+          <w:tcPr>
+            <w:tcW w:type="dxa" w:w="1337"/>
+          </w:tcPr>
+          <w:p>
+            <w:r>
+              <w:t>→ bac_si.ma_bac_si</w:t>
+            </w:r>
+          </w:p>
+        </w:tc>
+      </w:tr>
+    </w:tbl>
     <w:p>
       <w:pPr>
         <w:spacing w:line="288" w:lineRule="auto" w:after="60"/>
@@ -26724,6 +29420,102 @@
                 <w:sz w:val="22"/>
                 <w:szCs w:val="22"/>
               </w:rPr>
+            </w:r>
+          </w:p>
+        </w:tc>
+      </w:tr>
+      <w:tr>
+        <w:tc>
+          <w:tcPr>
+            <w:tcW w:type="dxa" w:w="1953"/>
+          </w:tcPr>
+          <w:p>
+            <w:r>
+              <w:t>loai_nv</w:t>
+            </w:r>
+          </w:p>
+        </w:tc>
+        <w:tc>
+          <w:tcPr>
+            <w:tcW w:type="dxa" w:w="4395"/>
+          </w:tcPr>
+          <w:p>
+            <w:r>
+              <w:t>BAC_SI, LE_TAN, QUAN_TRI_NHAN_SU, QUAN_TRI_TAI_KHOAN, QUAN_TRI_DANH_MUC</w:t>
+            </w:r>
+          </w:p>
+        </w:tc>
+        <w:tc>
+          <w:tcPr>
+            <w:tcW w:type="dxa" w:w="2442"/>
+          </w:tcPr>
+          <w:p>
+            <w:r>
+              <w:t>nhan_vien.loai_nv</w:t>
+            </w:r>
+          </w:p>
+        </w:tc>
+      </w:tr>
+      <w:tr>
+        <w:tc>
+          <w:tcPr>
+            <w:tcW w:type="dxa" w:w="1953"/>
+          </w:tcPr>
+          <w:p>
+            <w:r>
+              <w:t>loai_bac_si</w:t>
+            </w:r>
+          </w:p>
+        </w:tc>
+        <w:tc>
+          <w:tcPr>
+            <w:tcW w:type="dxa" w:w="4395"/>
+          </w:tcPr>
+          <w:p>
+            <w:r>
+              <w:t>DA_KHOA, CHUYEN_KHOA</w:t>
+            </w:r>
+          </w:p>
+        </w:tc>
+        <w:tc>
+          <w:tcPr>
+            <w:tcW w:type="dxa" w:w="2442"/>
+          </w:tcPr>
+          <w:p>
+            <w:r>
+              <w:t>bac_si.loai_bac_si</w:t>
+            </w:r>
+          </w:p>
+        </w:tc>
+      </w:tr>
+      <w:tr>
+        <w:tc>
+          <w:tcPr>
+            <w:tcW w:type="dxa" w:w="1953"/>
+          </w:tcPr>
+          <w:p>
+            <w:r>
+              <w:t>trang_thai_ca</w:t>
+            </w:r>
+          </w:p>
+        </w:tc>
+        <w:tc>
+          <w:tcPr>
+            <w:tcW w:type="dxa" w:w="4395"/>
+          </w:tcPr>
+          <w:p>
+            <w:r>
+              <w:t>DA_XEP, HUY</w:t>
+            </w:r>
+          </w:p>
+        </w:tc>
+        <w:tc>
+          <w:tcPr>
+            <w:tcW w:type="dxa" w:w="2442"/>
+          </w:tcPr>
+          <w:p>
+            <w:r>
+              <w:t>ca_lam_viec.trang_thai</w:t>
             </w:r>
           </w:p>
         </w:tc>
@@ -28491,22 +31283,8 @@
             <w:tcW w:w="2244" w:type="dxa"/>
           </w:tcPr>
           <w:p>
-            <w:pPr>
-              <w:spacing w:before="20" w:after="20"/>
-              <w:jc w:val="left"/>
-              <w:rPr>
-                <w:rFonts w:ascii="Times New Roman" w:cs="Times New Roman" w:eastAsia="Times New Roman" w:hAnsi="Times New Roman"/>
-                <w:sz w:val="22"/>
-                <w:szCs w:val="22"/>
-              </w:rPr>
-            </w:pPr>
-            <w:r>
-              <w:rPr>
-                <w:rFonts w:ascii="Times New Roman" w:cs="Times New Roman" w:eastAsia="Times New Roman" w:hAnsi="Times New Roman"/>
-                <w:sz w:val="22"/>
-                <w:szCs w:val="22"/>
-              </w:rPr>
-              <w:t xml:space="preserve">v_lich_truc_bac_si</w:t>
+            <w:r>
+              <w:t>v_lich_truc_bac_si</w:t>
             </w:r>
           </w:p>
         </w:tc>
@@ -28515,15 +31293,9 @@
             <w:tcW w:w="2992" w:type="dxa"/>
           </w:tcPr>
           <w:p>
-            <w:pPr>
-              <w:spacing w:before="20" w:after="20"/>
-              <w:jc w:val="left"/>
-              <w:rPr>
-                <w:rFonts w:ascii="Times New Roman" w:cs="Times New Roman" w:eastAsia="Times New Roman" w:hAnsi="Times New Roman"/>
-                <w:sz w:val="22"/>
-                <w:szCs w:val="22"/>
-              </w:rPr>
-            </w:pPr>
+            <w:r>
+              <w:t>Các ca làm việc đã xếp, kèm tên bác sĩ và chuyên khoa</w:t>
+            </w:r>
           </w:p>
         </w:tc>
         <w:tc>
@@ -28531,15 +31303,9 @@
             <w:tcW w:w="2057" w:type="dxa"/>
           </w:tcPr>
           <w:p>
-            <w:pPr>
-              <w:spacing w:before="20" w:after="20"/>
-              <w:jc w:val="left"/>
-              <w:rPr>
-                <w:rFonts w:ascii="Times New Roman" w:cs="Times New Roman" w:eastAsia="Times New Roman" w:hAnsi="Times New Roman"/>
-                <w:sz w:val="22"/>
-                <w:szCs w:val="22"/>
-              </w:rPr>
-            </w:pPr>
+            <w:r>
+              <w:t>ca_lam_viec, bac_si, nhan_vien, bac_si_chuyen_khoa, chuyen_khoa</w:t>
+            </w:r>
           </w:p>
         </w:tc>
         <w:tc>
@@ -28547,15 +31313,9 @@
             <w:tcW w:w="1497" w:type="dxa"/>
           </w:tcPr>
           <w:p>
-            <w:pPr>
-              <w:spacing w:before="20" w:after="20"/>
-              <w:jc w:val="left"/>
-              <w:rPr>
-                <w:rFonts w:ascii="Times New Roman" w:cs="Times New Roman" w:eastAsia="Times New Roman" w:hAnsi="Times New Roman"/>
-                <w:sz w:val="22"/>
-                <w:szCs w:val="22"/>
-              </w:rPr>
-            </w:pPr>
+            <w:r>
+              <w:t>Lễ tân, bác sĩ</w:t>
+            </w:r>
           </w:p>
         </w:tc>
       </w:tr>
@@ -28935,7 +31695,7 @@
                 <w:sz w:val="22"/>
                 <w:szCs w:val="22"/>
               </w:rPr>
-              <w:t xml:space="preserve">trg_bao_ve_ca_lam_viec</w:t>
+              <w:t>trg_lich_hen_hop_le</w:t>
             </w:r>
           </w:p>
         </w:tc>
@@ -28959,7 +31719,7 @@
                 <w:sz w:val="22"/>
                 <w:szCs w:val="22"/>
               </w:rPr>
-              <w:t xml:space="preserve">ca_lam_viec / BEFORE UPDATE</w:t>
+              <w:t>lich_hen / BEFORE INSERT, UPDATE OF thoi_gian_bd, thoi_gian_kt, ma_bac_si, ma_bn, ma_giay</w:t>
             </w:r>
           </w:p>
         </w:tc>
@@ -28983,7 +31743,7 @@
                 <w:sz w:val="22"/>
                 <w:szCs w:val="22"/>
               </w:rPr>
-              <w:t xml:space="preserve">BR-A08</w:t>
+              <w:t>BR-B01, BR-B03</w:t>
             </w:r>
           </w:p>
         </w:tc>
@@ -29007,7 +31767,7 @@
                 <w:sz w:val="22"/>
                 <w:szCs w:val="22"/>
               </w:rPr>
-              <w:t xml:space="preserve">RAISE EXCEPTION</w:t>
+              <w:t>RAISE EXCEPTION (check_violation), thông báo bắt đầu bằng mã quy tắc</w:t>
             </w:r>
           </w:p>
         </w:tc>
@@ -29036,7 +31796,7 @@
                 <w:sz w:val="22"/>
                 <w:szCs w:val="22"/>
               </w:rPr>
-              <w:t xml:space="preserve">trg_kiem_tra_chung_chi</w:t>
+              <w:t>trg_trang_thai_lich_hen</w:t>
             </w:r>
           </w:p>
         </w:tc>
@@ -29054,6 +31814,14 @@
                 <w:szCs w:val="22"/>
               </w:rPr>
             </w:pPr>
+            <w:r>
+              <w:rPr>
+                <w:rFonts w:ascii="Times New Roman" w:cs="Times New Roman" w:eastAsia="Times New Roman" w:hAnsi="Times New Roman"/>
+                <w:sz w:val="22"/>
+                <w:szCs w:val="22"/>
+              </w:rPr>
+              <w:t>lich_hen / BEFORE INSERT, UPDATE</w:t>
+            </w:r>
           </w:p>
         </w:tc>
         <w:tc>
@@ -29076,7 +31844,7 @@
                 <w:sz w:val="22"/>
                 <w:szCs w:val="22"/>
               </w:rPr>
-              <w:t xml:space="preserve">BR-A03</w:t>
+              <w:t>BR-B05</w:t>
             </w:r>
           </w:p>
         </w:tc>
@@ -29094,6 +31862,14 @@
                 <w:szCs w:val="22"/>
               </w:rPr>
             </w:pPr>
+            <w:r>
+              <w:rPr>
+                <w:rFonts w:ascii="Times New Roman" w:cs="Times New Roman" w:eastAsia="Times New Roman" w:hAnsi="Times New Roman"/>
+                <w:sz w:val="22"/>
+                <w:szCs w:val="22"/>
+              </w:rPr>
+              <w:t>Như trên</w:t>
+            </w:r>
           </w:p>
         </w:tc>
       </w:tr>
@@ -29121,7 +31897,7 @@
                 <w:sz w:val="22"/>
                 <w:szCs w:val="22"/>
               </w:rPr>
-              <w:t>trg_lich_hen_hop_le</w:t>
+              <w:t>trg_tai_khoan_vai_tro</w:t>
             </w:r>
           </w:p>
         </w:tc>
@@ -29145,7 +31921,7 @@
                 <w:sz w:val="22"/>
                 <w:szCs w:val="22"/>
               </w:rPr>
-              <w:t>lich_hen / BEFORE INSERT, UPDATE OF thoi_gian_bd, thoi_gian_kt, ma_bac_si, ma_bn, ma_giay</w:t>
+              <w:t>tai_khoan / BEFORE INSERT, UPDATE OF vai_tro, ma_nv</w:t>
             </w:r>
           </w:p>
         </w:tc>
@@ -29169,7 +31945,7 @@
                 <w:sz w:val="22"/>
                 <w:szCs w:val="22"/>
               </w:rPr>
-              <w:t>BR-B01, BR-B03</w:t>
+              <w:t>BR-B09</w:t>
             </w:r>
           </w:p>
         </w:tc>
@@ -29193,7 +31969,7 @@
                 <w:sz w:val="22"/>
                 <w:szCs w:val="22"/>
               </w:rPr>
-              <w:t>RAISE EXCEPTION (check_violation), thông báo bắt đầu bằng mã quy tắc</w:t>
+              <w:t>Như trên</w:t>
             </w:r>
           </w:p>
         </w:tc>
@@ -29222,7 +31998,7 @@
                 <w:sz w:val="22"/>
                 <w:szCs w:val="22"/>
               </w:rPr>
-              <w:t>trg_trang_thai_lich_hen</w:t>
+              <w:t>trg_tai_khoan_khong_xoa</w:t>
             </w:r>
           </w:p>
         </w:tc>
@@ -29246,7 +32022,7 @@
                 <w:sz w:val="22"/>
                 <w:szCs w:val="22"/>
               </w:rPr>
-              <w:t>lich_hen / BEFORE INSERT, UPDATE</w:t>
+              <w:t>tai_khoan / BEFORE DELETE (mức dòng)</w:t>
             </w:r>
           </w:p>
         </w:tc>
@@ -29270,7 +32046,7 @@
                 <w:sz w:val="22"/>
                 <w:szCs w:val="22"/>
               </w:rPr>
-              <w:t>BR-B05</w:t>
+              <w:t>BR-B10</w:t>
             </w:r>
           </w:p>
         </w:tc>
@@ -29323,7 +32099,7 @@
                 <w:sz w:val="22"/>
                 <w:szCs w:val="22"/>
               </w:rPr>
-              <w:t>trg_tai_khoan_vai_tro</w:t>
+              <w:t>trg_tai_khoan_khong_truncate</w:t>
             </w:r>
           </w:p>
         </w:tc>
@@ -29347,7 +32123,7 @@
                 <w:sz w:val="22"/>
                 <w:szCs w:val="22"/>
               </w:rPr>
-              <w:t>tai_khoan / BEFORE INSERT, UPDATE OF vai_tro, ma_nv</w:t>
+              <w:t>tai_khoan / BEFORE TRUNCATE (mức câu lệnh)</w:t>
             </w:r>
           </w:p>
         </w:tc>
@@ -29371,7 +32147,7 @@
                 <w:sz w:val="22"/>
                 <w:szCs w:val="22"/>
               </w:rPr>
-              <w:t>BR-B09</w:t>
+              <w:t>BR-B10</w:t>
             </w:r>
           </w:p>
         </w:tc>
@@ -29424,7 +32200,7 @@
                 <w:sz w:val="22"/>
                 <w:szCs w:val="22"/>
               </w:rPr>
-              <w:t>trg_tai_khoan_khong_xoa</w:t>
+              <w:t xml:space="preserve">trg_chan_thuoc_di_ung</w:t>
             </w:r>
           </w:p>
         </w:tc>
@@ -29442,14 +32218,6 @@
                 <w:szCs w:val="22"/>
               </w:rPr>
             </w:pPr>
-            <w:r>
-              <w:rPr>
-                <w:rFonts w:ascii="Times New Roman" w:cs="Times New Roman" w:eastAsia="Times New Roman" w:hAnsi="Times New Roman"/>
-                <w:sz w:val="22"/>
-                <w:szCs w:val="22"/>
-              </w:rPr>
-              <w:t>tai_khoan / BEFORE DELETE (mức dòng)</w:t>
-            </w:r>
           </w:p>
         </w:tc>
         <w:tc>
@@ -29472,7 +32240,7 @@
                 <w:sz w:val="22"/>
                 <w:szCs w:val="22"/>
               </w:rPr>
-              <w:t>BR-B10</w:t>
+              <w:t xml:space="preserve">BR-C01</w:t>
             </w:r>
           </w:p>
         </w:tc>
@@ -29490,14 +32258,6 @@
                 <w:szCs w:val="22"/>
               </w:rPr>
             </w:pPr>
-            <w:r>
-              <w:rPr>
-                <w:rFonts w:ascii="Times New Roman" w:cs="Times New Roman" w:eastAsia="Times New Roman" w:hAnsi="Times New Roman"/>
-                <w:sz w:val="22"/>
-                <w:szCs w:val="22"/>
-              </w:rPr>
-              <w:t>Như trên</w:t>
-            </w:r>
           </w:p>
         </w:tc>
       </w:tr>
@@ -29525,7 +32285,7 @@
                 <w:sz w:val="22"/>
                 <w:szCs w:val="22"/>
               </w:rPr>
-              <w:t>trg_tai_khoan_khong_truncate</w:t>
+              <w:t xml:space="preserve">trg_lan_kham_hoan_thanh</w:t>
             </w:r>
           </w:p>
         </w:tc>
@@ -29543,14 +32303,6 @@
                 <w:szCs w:val="22"/>
               </w:rPr>
             </w:pPr>
-            <w:r>
-              <w:rPr>
-                <w:rFonts w:ascii="Times New Roman" w:cs="Times New Roman" w:eastAsia="Times New Roman" w:hAnsi="Times New Roman"/>
-                <w:sz w:val="22"/>
-                <w:szCs w:val="22"/>
-              </w:rPr>
-              <w:t>tai_khoan / BEFORE TRUNCATE (mức câu lệnh)</w:t>
-            </w:r>
           </w:p>
         </w:tc>
         <w:tc>
@@ -29573,7 +32325,7 @@
                 <w:sz w:val="22"/>
                 <w:szCs w:val="22"/>
               </w:rPr>
-              <w:t>BR-B10</w:t>
+              <w:t xml:space="preserve">BR-C02</w:t>
             </w:r>
           </w:p>
         </w:tc>
@@ -29591,14 +32343,6 @@
                 <w:szCs w:val="22"/>
               </w:rPr>
             </w:pPr>
-            <w:r>
-              <w:rPr>
-                <w:rFonts w:ascii="Times New Roman" w:cs="Times New Roman" w:eastAsia="Times New Roman" w:hAnsi="Times New Roman"/>
-                <w:sz w:val="22"/>
-                <w:szCs w:val="22"/>
-              </w:rPr>
-              <w:t>Như trên</w:t>
-            </w:r>
           </w:p>
         </w:tc>
       </w:tr>
@@ -29626,7 +32370,7 @@
                 <w:sz w:val="22"/>
                 <w:szCs w:val="22"/>
               </w:rPr>
-              <w:t xml:space="preserve">trg_chan_thuoc_di_ung</w:t>
+              <w:t xml:space="preserve">trg_khong_xoa_benh_an</w:t>
             </w:r>
           </w:p>
         </w:tc>
@@ -29666,7 +32410,7 @@
                 <w:sz w:val="22"/>
                 <w:szCs w:val="22"/>
               </w:rPr>
-              <w:t xml:space="preserve">BR-C01</w:t>
+              <w:t xml:space="preserve">BR-C05</w:t>
             </w:r>
           </w:p>
         </w:tc>
@@ -29688,172 +32432,170 @@
         </w:tc>
       </w:tr>
       <w:tr>
-        <w:trPr>
-          <w:cantSplit/>
-        </w:trPr>
-        <w:tc>
-          <w:tcPr>
-            <w:tcW w:w="2618" w:type="dxa"/>
-          </w:tcPr>
-          <w:p>
-            <w:pPr>
-              <w:spacing w:before="20" w:after="20"/>
-              <w:jc w:val="left"/>
-              <w:rPr>
-                <w:rFonts w:ascii="Times New Roman" w:cs="Times New Roman" w:eastAsia="Times New Roman" w:hAnsi="Times New Roman"/>
-                <w:sz w:val="22"/>
-                <w:szCs w:val="22"/>
-              </w:rPr>
-            </w:pPr>
-            <w:r>
-              <w:rPr>
-                <w:rFonts w:ascii="Times New Roman" w:cs="Times New Roman" w:eastAsia="Times New Roman" w:hAnsi="Times New Roman"/>
-                <w:sz w:val="22"/>
-                <w:szCs w:val="22"/>
-              </w:rPr>
-              <w:t xml:space="preserve">trg_lan_kham_hoan_thanh</w:t>
-            </w:r>
-          </w:p>
-        </w:tc>
-        <w:tc>
-          <w:tcPr>
-            <w:tcW w:w="2431" w:type="dxa"/>
-          </w:tcPr>
-          <w:p>
-            <w:pPr>
-              <w:spacing w:before="20" w:after="20"/>
-              <w:jc w:val="left"/>
-              <w:rPr>
-                <w:rFonts w:ascii="Times New Roman" w:cs="Times New Roman" w:eastAsia="Times New Roman" w:hAnsi="Times New Roman"/>
-                <w:sz w:val="22"/>
-                <w:szCs w:val="22"/>
-              </w:rPr>
-            </w:pPr>
-          </w:p>
-        </w:tc>
-        <w:tc>
-          <w:tcPr>
-            <w:tcW w:w="1683" w:type="dxa"/>
-          </w:tcPr>
-          <w:p>
-            <w:pPr>
-              <w:spacing w:before="20" w:after="20"/>
-              <w:jc w:val="left"/>
-              <w:rPr>
-                <w:rFonts w:ascii="Times New Roman" w:cs="Times New Roman" w:eastAsia="Times New Roman" w:hAnsi="Times New Roman"/>
-                <w:sz w:val="22"/>
-                <w:szCs w:val="22"/>
-              </w:rPr>
-            </w:pPr>
-            <w:r>
-              <w:rPr>
-                <w:rFonts w:ascii="Times New Roman" w:cs="Times New Roman" w:eastAsia="Times New Roman" w:hAnsi="Times New Roman"/>
-                <w:sz w:val="22"/>
-                <w:szCs w:val="22"/>
-              </w:rPr>
-              <w:t xml:space="preserve">BR-C02</w:t>
-            </w:r>
-          </w:p>
-        </w:tc>
-        <w:tc>
-          <w:tcPr>
-            <w:tcW w:w="2058" w:type="dxa"/>
-          </w:tcPr>
-          <w:p>
-            <w:pPr>
-              <w:spacing w:before="20" w:after="20"/>
-              <w:jc w:val="left"/>
-              <w:rPr>
-                <w:rFonts w:ascii="Times New Roman" w:cs="Times New Roman" w:eastAsia="Times New Roman" w:hAnsi="Times New Roman"/>
-                <w:sz w:val="22"/>
-                <w:szCs w:val="22"/>
-              </w:rPr>
-            </w:pPr>
+        <w:tc>
+          <w:tcPr>
+            <w:tcW w:type="dxa" w:w="2618"/>
+          </w:tcPr>
+          <w:p>
+            <w:r>
+              <w:t>trg_phan_lop_*</w:t>
+            </w:r>
+          </w:p>
+        </w:tc>
+        <w:tc>
+          <w:tcPr>
+            <w:tcW w:type="dxa" w:w="2431"/>
+          </w:tcPr>
+          <w:p>
+            <w:r>
+              <w:t>NHAN_VIEN/BAC_SI/lớp con / constraint deferred</w:t>
+            </w:r>
+          </w:p>
+        </w:tc>
+        <w:tc>
+          <w:tcPr>
+            <w:tcW w:type="dxa" w:w="1683"/>
+          </w:tcPr>
+          <w:p>
+            <w:r>
+              <w:t>BR-A01, BR-A02, BR-A10</w:t>
+            </w:r>
+          </w:p>
+        </w:tc>
+        <w:tc>
+          <w:tcPr>
+            <w:tcW w:type="dxa" w:w="2058"/>
+          </w:tcPr>
+          <w:p>
+            <w:r>
+              <w:t>RAISE EXCEPTION (check_violation)</w:t>
+            </w:r>
           </w:p>
         </w:tc>
       </w:tr>
       <w:tr>
-        <w:trPr>
-          <w:cantSplit/>
-        </w:trPr>
-        <w:tc>
-          <w:tcPr>
-            <w:tcW w:w="2618" w:type="dxa"/>
-          </w:tcPr>
-          <w:p>
-            <w:pPr>
-              <w:spacing w:before="20" w:after="20"/>
-              <w:jc w:val="left"/>
-              <w:rPr>
-                <w:rFonts w:ascii="Times New Roman" w:cs="Times New Roman" w:eastAsia="Times New Roman" w:hAnsi="Times New Roman"/>
-                <w:sz w:val="22"/>
-                <w:szCs w:val="22"/>
-              </w:rPr>
-            </w:pPr>
-            <w:r>
-              <w:rPr>
-                <w:rFonts w:ascii="Times New Roman" w:cs="Times New Roman" w:eastAsia="Times New Roman" w:hAnsi="Times New Roman"/>
-                <w:sz w:val="22"/>
-                <w:szCs w:val="22"/>
-              </w:rPr>
-              <w:t xml:space="preserve">trg_khong_xoa_benh_an</w:t>
-            </w:r>
-          </w:p>
-        </w:tc>
-        <w:tc>
-          <w:tcPr>
-            <w:tcW w:w="2431" w:type="dxa"/>
-          </w:tcPr>
-          <w:p>
-            <w:pPr>
-              <w:spacing w:before="20" w:after="20"/>
-              <w:jc w:val="left"/>
-              <w:rPr>
-                <w:rFonts w:ascii="Times New Roman" w:cs="Times New Roman" w:eastAsia="Times New Roman" w:hAnsi="Times New Roman"/>
-                <w:sz w:val="22"/>
-                <w:szCs w:val="22"/>
-              </w:rPr>
-            </w:pPr>
-          </w:p>
-        </w:tc>
-        <w:tc>
-          <w:tcPr>
-            <w:tcW w:w="1683" w:type="dxa"/>
-          </w:tcPr>
-          <w:p>
-            <w:pPr>
-              <w:spacing w:before="20" w:after="20"/>
-              <w:jc w:val="left"/>
-              <w:rPr>
-                <w:rFonts w:ascii="Times New Roman" w:cs="Times New Roman" w:eastAsia="Times New Roman" w:hAnsi="Times New Roman"/>
-                <w:sz w:val="22"/>
-                <w:szCs w:val="22"/>
-              </w:rPr>
-            </w:pPr>
-            <w:r>
-              <w:rPr>
-                <w:rFonts w:ascii="Times New Roman" w:cs="Times New Roman" w:eastAsia="Times New Roman" w:hAnsi="Times New Roman"/>
-                <w:sz w:val="22"/>
-                <w:szCs w:val="22"/>
-              </w:rPr>
-              <w:t xml:space="preserve">BR-C05</w:t>
-            </w:r>
-          </w:p>
-        </w:tc>
-        <w:tc>
-          <w:tcPr>
-            <w:tcW w:w="2058" w:type="dxa"/>
-          </w:tcPr>
-          <w:p>
-            <w:pPr>
-              <w:spacing w:before="20" w:after="20"/>
-              <w:jc w:val="left"/>
-              <w:rPr>
-                <w:rFonts w:ascii="Times New Roman" w:cs="Times New Roman" w:eastAsia="Times New Roman" w:hAnsi="Times New Roman"/>
-                <w:sz w:val="22"/>
-                <w:szCs w:val="22"/>
-              </w:rPr>
-            </w:pPr>
+        <w:tc>
+          <w:tcPr>
+            <w:tcW w:type="dxa" w:w="2618"/>
+          </w:tcPr>
+          <w:p>
+            <w:r>
+              <w:t>trg_ca_lam_viec_hop_le</w:t>
+            </w:r>
+          </w:p>
+        </w:tc>
+        <w:tc>
+          <w:tcPr>
+            <w:tcW w:type="dxa" w:w="2431"/>
+          </w:tcPr>
+          <w:p>
+            <w:r>
+              <w:t>ca_lam_viec / BEFORE INSERT, UPDATE</w:t>
+            </w:r>
+          </w:p>
+        </w:tc>
+        <w:tc>
+          <w:tcPr>
+            <w:tcW w:type="dxa" w:w="1683"/>
+          </w:tcPr>
+          <w:p>
+            <w:r>
+              <w:t>BR-A03, BR-A08</w:t>
+            </w:r>
+          </w:p>
+        </w:tc>
+        <w:tc>
+          <w:tcPr>
+            <w:tcW w:type="dxa" w:w="2058"/>
+          </w:tcPr>
+          <w:p>
+            <w:r>
+              <w:t>RAISE EXCEPTION (check_violation)</w:t>
+            </w:r>
+          </w:p>
+        </w:tc>
+      </w:tr>
+      <w:tr>
+        <w:tc>
+          <w:tcPr>
+            <w:tcW w:type="dxa" w:w="2618"/>
+          </w:tcPr>
+          <w:p>
+            <w:r>
+              <w:t>trg_giay_phep_khong_vo_hieu_ca</w:t>
+            </w:r>
+          </w:p>
+        </w:tc>
+        <w:tc>
+          <w:tcPr>
+            <w:tcW w:type="dxa" w:w="2431"/>
+          </w:tcPr>
+          <w:p>
+            <w:r>
+              <w:t>bac_si / BEFORE UPDATE ngày hết hạn</w:t>
+            </w:r>
+          </w:p>
+        </w:tc>
+        <w:tc>
+          <w:tcPr>
+            <w:tcW w:type="dxa" w:w="1683"/>
+          </w:tcPr>
+          <w:p>
+            <w:r>
+              <w:t>BR-A03</w:t>
+            </w:r>
+          </w:p>
+        </w:tc>
+        <w:tc>
+          <w:tcPr>
+            <w:tcW w:type="dxa" w:w="2058"/>
+          </w:tcPr>
+          <w:p>
+            <w:r>
+              <w:t>RAISE EXCEPTION (check_violation)</w:t>
+            </w:r>
+          </w:p>
+        </w:tc>
+      </w:tr>
+      <w:tr>
+        <w:tc>
+          <w:tcPr>
+            <w:tcW w:type="dxa" w:w="2618"/>
+          </w:tcPr>
+          <w:p>
+            <w:r>
+              <w:t>trg_ca_lam_viec_khong_xoa</w:t>
+            </w:r>
+          </w:p>
+        </w:tc>
+        <w:tc>
+          <w:tcPr>
+            <w:tcW w:type="dxa" w:w="2431"/>
+          </w:tcPr>
+          <w:p>
+            <w:r>
+              <w:t>ca_lam_viec / BEFORE DELETE</w:t>
+            </w:r>
+          </w:p>
+        </w:tc>
+        <w:tc>
+          <w:tcPr>
+            <w:tcW w:type="dxa" w:w="1683"/>
+          </w:tcPr>
+          <w:p>
+            <w:r>
+              <w:t>BR-A08</w:t>
+            </w:r>
+          </w:p>
+        </w:tc>
+        <w:tc>
+          <w:tcPr>
+            <w:tcW w:type="dxa" w:w="2058"/>
+          </w:tcPr>
+          <w:p>
+            <w:r>
+              <w:t>RAISE EXCEPTION (check_violation)</w:t>
+            </w:r>
           </w:p>
         </w:tc>
       </w:tr>
@@ -30072,22 +32814,8 @@
             <w:tcW w:w="7823" w:type="dxa"/>
           </w:tcPr>
           <w:p>
-            <w:pPr>
-              <w:spacing w:before="20" w:after="20"/>
-              <w:jc w:val="left"/>
-              <w:rPr>
-                <w:rFonts w:ascii="Times New Roman" w:cs="Times New Roman" w:eastAsia="Times New Roman" w:hAnsi="Times New Roman"/>
-                <w:sz w:val="22"/>
-                <w:szCs w:val="22"/>
-              </w:rPr>
-            </w:pPr>
-            <w:r>
-              <w:rPr>
-                <w:rFonts w:ascii="Times New Roman" w:cs="Times New Roman" w:eastAsia="Times New Roman" w:hAnsi="Times New Roman"/>
-                <w:sz w:val="22"/>
-                <w:szCs w:val="22"/>
-              </w:rPr>
-              <w:t xml:space="preserve">Cột phân loại loai_bac_si + CHECK</w:t>
+            <w:r>
+              <w:t>loai_bac_si + các bảng lớp con; constraint trigger deferred giữ total/disjoint</w:t>
             </w:r>
           </w:p>
         </w:tc>
@@ -30125,22 +32853,8 @@
             <w:tcW w:w="7823" w:type="dxa"/>
           </w:tcPr>
           <w:p>
-            <w:pPr>
-              <w:spacing w:before="20" w:after="20"/>
-              <w:jc w:val="left"/>
-              <w:rPr>
-                <w:rFonts w:ascii="Times New Roman" w:cs="Times New Roman" w:eastAsia="Times New Roman" w:hAnsi="Times New Roman"/>
-                <w:sz w:val="22"/>
-                <w:szCs w:val="22"/>
-              </w:rPr>
-            </w:pPr>
-            <w:r>
-              <w:rPr>
-                <w:rFonts w:ascii="Times New Roman" w:cs="Times New Roman" w:eastAsia="Times New Roman" w:hAnsi="Times New Roman"/>
-                <w:sz w:val="22"/>
-                <w:szCs w:val="22"/>
-              </w:rPr>
-              <w:t xml:space="preserve">FK ma_chuyen_khoa NOT NULL</w:t>
+            <w:r>
+              <w:t>FK NOT NULL BAC_SI_CHUYEN_KHOA.ma_chuyen_khoa; trigger giữ đúng lớp con</w:t>
             </w:r>
           </w:p>
         </w:tc>
@@ -30178,22 +32892,8 @@
             <w:tcW w:w="7823" w:type="dxa"/>
           </w:tcPr>
           <w:p>
-            <w:pPr>
-              <w:spacing w:before="20" w:after="20"/>
-              <w:jc w:val="left"/>
-              <w:rPr>
-                <w:rFonts w:ascii="Times New Roman" w:cs="Times New Roman" w:eastAsia="Times New Roman" w:hAnsi="Times New Roman"/>
-                <w:sz w:val="22"/>
-                <w:szCs w:val="22"/>
-              </w:rPr>
-            </w:pPr>
-            <w:r>
-              <w:rPr>
-                <w:rFonts w:ascii="Times New Roman" w:cs="Times New Roman" w:eastAsia="Times New Roman" w:hAnsi="Times New Roman"/>
-                <w:sz w:val="22"/>
-                <w:szCs w:val="22"/>
-              </w:rPr>
-              <w:t xml:space="preserve">Trigger trg_kiem_tra_chung_chi</w:t>
+            <w:r>
+              <w:t>trg_ca_lam_viec_hop_le; trg_giay_phep_khong_vo_hieu_ca</w:t>
             </w:r>
           </w:p>
         </w:tc>
@@ -30231,22 +32931,8 @@
             <w:tcW w:w="7823" w:type="dxa"/>
           </w:tcPr>
           <w:p>
-            <w:pPr>
-              <w:spacing w:before="20" w:after="20"/>
-              <w:jc w:val="left"/>
-              <w:rPr>
-                <w:rFonts w:ascii="Times New Roman" w:cs="Times New Roman" w:eastAsia="Times New Roman" w:hAnsi="Times New Roman"/>
-                <w:sz w:val="22"/>
-                <w:szCs w:val="22"/>
-              </w:rPr>
-            </w:pPr>
-            <w:r>
-              <w:rPr>
-                <w:rFonts w:ascii="Times New Roman" w:cs="Times New Roman" w:eastAsia="Times New Roman" w:hAnsi="Times New Roman"/>
-                <w:sz w:val="22"/>
-                <w:szCs w:val="22"/>
-              </w:rPr>
-              <w:t xml:space="preserve">EXCLUDE USING gist</w:t>
+            <w:r>
+              <w:t>ex_ca_lam_viec_bac_si (EXCLUDE USING gist, khoảng [))</w:t>
             </w:r>
           </w:p>
         </w:tc>
@@ -30443,22 +33129,8 @@
             <w:tcW w:w="7823" w:type="dxa"/>
           </w:tcPr>
           <w:p>
-            <w:pPr>
-              <w:spacing w:before="20" w:after="20"/>
-              <w:jc w:val="left"/>
-              <w:rPr>
-                <w:rFonts w:ascii="Times New Roman" w:cs="Times New Roman" w:eastAsia="Times New Roman" w:hAnsi="Times New Roman"/>
-                <w:sz w:val="22"/>
-                <w:szCs w:val="22"/>
-              </w:rPr>
-            </w:pPr>
-            <w:r>
-              <w:rPr>
-                <w:rFonts w:ascii="Times New Roman" w:cs="Times New Roman" w:eastAsia="Times New Roman" w:hAnsi="Times New Roman"/>
-                <w:sz w:val="22"/>
-                <w:szCs w:val="22"/>
-              </w:rPr>
-              <w:t xml:space="preserve">Trigger trg_bao_ve_ca_lam_viec</w:t>
+            <w:r>
+              <w:t>trg_ca_lam_viec_hop_le; trg_ca_lam_viec_khong_xoa</w:t>
             </w:r>
           </w:p>
         </w:tc>
@@ -30549,22 +33221,8 @@
             <w:tcW w:w="7823" w:type="dxa"/>
           </w:tcPr>
           <w:p>
-            <w:pPr>
-              <w:spacing w:before="20" w:after="20"/>
-              <w:jc w:val="left"/>
-              <w:rPr>
-                <w:rFonts w:ascii="Times New Roman" w:cs="Times New Roman" w:eastAsia="Times New Roman" w:hAnsi="Times New Roman"/>
-                <w:sz w:val="22"/>
-                <w:szCs w:val="22"/>
-              </w:rPr>
-            </w:pPr>
-            <w:r>
-              <w:rPr>
-                <w:rFonts w:ascii="Times New Roman" w:cs="Times New Roman" w:eastAsia="Times New Roman" w:hAnsi="Times New Roman"/>
-                <w:sz w:val="22"/>
-                <w:szCs w:val="22"/>
-              </w:rPr>
-              <w:t xml:space="preserve">CHECK miền loai_nv; FK (ma_bac_si, loai_nv) → nhan_vien(ma_nv, loai_nv)</w:t>
+            <w:r>
+              <w:t>CHECK miền loai_nv; constraint trigger deferred kiểm tra NHAN_VIEN ↔ BAC_SI</w:t>
             </w:r>
           </w:p>
         </w:tc>

</xml_diff>